<commit_message>
docs(m0): cierre de M0 en 2.0.0-alpha.1, estados de HU y RN y descargas (HU-0.1 a HU-0.4, HU-T.15 a HU-T.19, HU-5.8)
</commit_message>
<xml_diff>
--- a/public/docs/descargas/ficha.docx
+++ b/public/docs/descargas/ficha.docx
@@ -29,7 +29,7 @@
         <w:pStyle w:val="PortadaRevision"/>
       </w:pPr>
       <w:r>
-        <w:t>Revisión 3.1</w:t>
+        <w:t>Revisión 3.2</w:t>
       </w:r>
     </w:p>
     <w:p>
@@ -93,7 +93,7 @@
           <w:noProof/>
         </w:rPr>
         <w:drawing>
-          <wp:inline distT="0" distB="0" distL="0" distR="0" wp14:anchorId="02DF2923" wp14:editId="02DF2924">
+          <wp:inline distT="0" distB="0" distL="0" distR="0" wp14:anchorId="63249F37" wp14:editId="63249F38">
             <wp:extent cx="395999" cy="405503"/>
             <wp:effectExtent l="0" t="0" r="0" b="0"/>
             <wp:docPr id="10" name="Picture"/>
@@ -229,7 +229,7 @@
               <w:pStyle w:val="Celda"/>
             </w:pPr>
             <w:r>
-              <w:t>06/10/2026</w:t>
+              <w:t>11/10/2026</w:t>
             </w:r>
           </w:p>
         </w:tc>
@@ -242,7 +242,7 @@
               <w:pStyle w:val="Celda"/>
             </w:pPr>
             <w:r>
-              <w:t>3.1</w:t>
+              <w:t>3.2</w:t>
             </w:r>
           </w:p>
         </w:tc>
@@ -409,7 +409,7 @@
       <w:r>
         <w:fldChar w:fldCharType="separate"/>
       </w:r>
-      <w:hyperlink w:anchor="_Toc242196617" w:history="1">
+      <w:hyperlink w:anchor="_Toc242627939" w:history="1">
         <w:r>
           <w:rPr>
             <w:rStyle w:val="Hipervnculo"/>
@@ -436,7 +436,7 @@
             <w:noProof/>
             <w:webHidden/>
           </w:rPr>
-          <w:instrText xml:space="preserve"> PAGEREF _Toc242196617 \h </w:instrText>
+          <w:instrText xml:space="preserve"> PAGEREF _Toc242627939 \h </w:instrText>
         </w:r>
         <w:r>
           <w:rPr>
@@ -482,7 +482,7 @@
           <w14:ligatures w14:val="standardContextual"/>
         </w:rPr>
       </w:pPr>
-      <w:hyperlink w:anchor="_Toc242196618" w:history="1">
+      <w:hyperlink w:anchor="_Toc242627940" w:history="1">
         <w:r>
           <w:rPr>
             <w:rStyle w:val="Hipervnculo"/>
@@ -509,7 +509,7 @@
             <w:noProof/>
             <w:webHidden/>
           </w:rPr>
-          <w:instrText xml:space="preserve"> PAGEREF _Toc242196618 \h </w:instrText>
+          <w:instrText xml:space="preserve"> PAGEREF _Toc242627940 \h </w:instrText>
         </w:r>
         <w:r>
           <w:rPr>
@@ -555,7 +555,7 @@
           <w14:ligatures w14:val="standardContextual"/>
         </w:rPr>
       </w:pPr>
-      <w:hyperlink w:anchor="_Toc242196619" w:history="1">
+      <w:hyperlink w:anchor="_Toc242627941" w:history="1">
         <w:r>
           <w:rPr>
             <w:rStyle w:val="Hipervnculo"/>
@@ -582,7 +582,7 @@
             <w:noProof/>
             <w:webHidden/>
           </w:rPr>
-          <w:instrText xml:space="preserve"> PAGEREF _Toc242196619 \h </w:instrText>
+          <w:instrText xml:space="preserve"> PAGEREF _Toc242627941 \h </w:instrText>
         </w:r>
         <w:r>
           <w:rPr>
@@ -628,7 +628,7 @@
           <w14:ligatures w14:val="standardContextual"/>
         </w:rPr>
       </w:pPr>
-      <w:hyperlink w:anchor="_Toc242196620" w:history="1">
+      <w:hyperlink w:anchor="_Toc242627942" w:history="1">
         <w:r>
           <w:rPr>
             <w:rStyle w:val="Hipervnculo"/>
@@ -655,7 +655,7 @@
             <w:noProof/>
             <w:webHidden/>
           </w:rPr>
-          <w:instrText xml:space="preserve"> PAGEREF _Toc242196620 \h </w:instrText>
+          <w:instrText xml:space="preserve"> PAGEREF _Toc242627942 \h </w:instrText>
         </w:r>
         <w:r>
           <w:rPr>
@@ -701,7 +701,7 @@
           <w14:ligatures w14:val="standardContextual"/>
         </w:rPr>
       </w:pPr>
-      <w:hyperlink w:anchor="_Toc242196621" w:history="1">
+      <w:hyperlink w:anchor="_Toc242627943" w:history="1">
         <w:r>
           <w:rPr>
             <w:rStyle w:val="Hipervnculo"/>
@@ -728,7 +728,7 @@
             <w:noProof/>
             <w:webHidden/>
           </w:rPr>
-          <w:instrText xml:space="preserve"> PAGEREF _Toc242196621 \h </w:instrText>
+          <w:instrText xml:space="preserve"> PAGEREF _Toc242627943 \h </w:instrText>
         </w:r>
         <w:r>
           <w:rPr>
@@ -774,7 +774,7 @@
           <w14:ligatures w14:val="standardContextual"/>
         </w:rPr>
       </w:pPr>
-      <w:hyperlink w:anchor="_Toc242196622" w:history="1">
+      <w:hyperlink w:anchor="_Toc242627944" w:history="1">
         <w:r>
           <w:rPr>
             <w:rStyle w:val="Hipervnculo"/>
@@ -801,7 +801,7 @@
             <w:noProof/>
             <w:webHidden/>
           </w:rPr>
-          <w:instrText xml:space="preserve"> PAGEREF _Toc242196622 \h </w:instrText>
+          <w:instrText xml:space="preserve"> PAGEREF _Toc242627944 \h </w:instrText>
         </w:r>
         <w:r>
           <w:rPr>
@@ -847,7 +847,7 @@
           <w14:ligatures w14:val="standardContextual"/>
         </w:rPr>
       </w:pPr>
-      <w:hyperlink w:anchor="_Toc242196623" w:history="1">
+      <w:hyperlink w:anchor="_Toc242627945" w:history="1">
         <w:r>
           <w:rPr>
             <w:rStyle w:val="Hipervnculo"/>
@@ -874,7 +874,7 @@
             <w:noProof/>
             <w:webHidden/>
           </w:rPr>
-          <w:instrText xml:space="preserve"> PAGEREF _Toc242196623 \h </w:instrText>
+          <w:instrText xml:space="preserve"> PAGEREF _Toc242627945 \h </w:instrText>
         </w:r>
         <w:r>
           <w:rPr>
@@ -920,7 +920,7 @@
           <w14:ligatures w14:val="standardContextual"/>
         </w:rPr>
       </w:pPr>
-      <w:hyperlink w:anchor="_Toc242196624" w:history="1">
+      <w:hyperlink w:anchor="_Toc242627946" w:history="1">
         <w:r>
           <w:rPr>
             <w:rStyle w:val="Hipervnculo"/>
@@ -947,7 +947,7 @@
             <w:noProof/>
             <w:webHidden/>
           </w:rPr>
-          <w:instrText xml:space="preserve"> PAGEREF _Toc242196624 \h </w:instrText>
+          <w:instrText xml:space="preserve"> PAGEREF _Toc242627946 \h </w:instrText>
         </w:r>
         <w:r>
           <w:rPr>
@@ -993,7 +993,7 @@
           <w14:ligatures w14:val="standardContextual"/>
         </w:rPr>
       </w:pPr>
-      <w:hyperlink w:anchor="_Toc242196625" w:history="1">
+      <w:hyperlink w:anchor="_Toc242627947" w:history="1">
         <w:r>
           <w:rPr>
             <w:rStyle w:val="Hipervnculo"/>
@@ -1020,7 +1020,7 @@
             <w:noProof/>
             <w:webHidden/>
           </w:rPr>
-          <w:instrText xml:space="preserve"> PAGEREF _Toc242196625 \h </w:instrText>
+          <w:instrText xml:space="preserve"> PAGEREF _Toc242627947 \h </w:instrText>
         </w:r>
         <w:r>
           <w:rPr>
@@ -1066,7 +1066,7 @@
           <w14:ligatures w14:val="standardContextual"/>
         </w:rPr>
       </w:pPr>
-      <w:hyperlink w:anchor="_Toc242196626" w:history="1">
+      <w:hyperlink w:anchor="_Toc242627948" w:history="1">
         <w:r>
           <w:rPr>
             <w:rStyle w:val="Hipervnculo"/>
@@ -1093,7 +1093,7 @@
             <w:noProof/>
             <w:webHidden/>
           </w:rPr>
-          <w:instrText xml:space="preserve"> PAGEREF _Toc242196626 \h </w:instrText>
+          <w:instrText xml:space="preserve"> PAGEREF _Toc242627948 \h </w:instrText>
         </w:r>
         <w:r>
           <w:rPr>
@@ -1139,7 +1139,7 @@
           <w14:ligatures w14:val="standardContextual"/>
         </w:rPr>
       </w:pPr>
-      <w:hyperlink w:anchor="_Toc242196627" w:history="1">
+      <w:hyperlink w:anchor="_Toc242627949" w:history="1">
         <w:r>
           <w:rPr>
             <w:rStyle w:val="Hipervnculo"/>
@@ -1166,7 +1166,7 @@
             <w:noProof/>
             <w:webHidden/>
           </w:rPr>
-          <w:instrText xml:space="preserve"> PAGEREF _Toc242196627 \h </w:instrText>
+          <w:instrText xml:space="preserve"> PAGEREF _Toc242627949 \h </w:instrText>
         </w:r>
         <w:r>
           <w:rPr>
@@ -1212,7 +1212,7 @@
           <w14:ligatures w14:val="standardContextual"/>
         </w:rPr>
       </w:pPr>
-      <w:hyperlink w:anchor="_Toc242196628" w:history="1">
+      <w:hyperlink w:anchor="_Toc242627950" w:history="1">
         <w:r>
           <w:rPr>
             <w:rStyle w:val="Hipervnculo"/>
@@ -1239,7 +1239,7 @@
             <w:noProof/>
             <w:webHidden/>
           </w:rPr>
-          <w:instrText xml:space="preserve"> PAGEREF _Toc242196628 \h </w:instrText>
+          <w:instrText xml:space="preserve"> PAGEREF _Toc242627950 \h </w:instrText>
         </w:r>
         <w:r>
           <w:rPr>
@@ -1285,7 +1285,7 @@
           <w14:ligatures w14:val="standardContextual"/>
         </w:rPr>
       </w:pPr>
-      <w:hyperlink w:anchor="_Toc242196629" w:history="1">
+      <w:hyperlink w:anchor="_Toc242627951" w:history="1">
         <w:r>
           <w:rPr>
             <w:rStyle w:val="Hipervnculo"/>
@@ -1312,7 +1312,7 @@
             <w:noProof/>
             <w:webHidden/>
           </w:rPr>
-          <w:instrText xml:space="preserve"> PAGEREF _Toc242196629 \h </w:instrText>
+          <w:instrText xml:space="preserve"> PAGEREF _Toc242627951 \h </w:instrText>
         </w:r>
         <w:r>
           <w:rPr>
@@ -1361,7 +1361,7 @@
         <w:pStyle w:val="Ttulo1"/>
       </w:pPr>
       <w:bookmarkStart w:id="0" w:name="_4e8520742576e7a8e4a7ac46877a11f7bda35c0"/>
-      <w:bookmarkStart w:id="1" w:name="_Toc242196617"/>
+      <w:bookmarkStart w:id="1" w:name="_Toc242627939"/>
       <w:r>
         <w:lastRenderedPageBreak/>
         <w:t>Identificación del Proyecto</w:t>
@@ -1761,17 +1761,14 @@
               <w:keepNext/>
             </w:pPr>
             <w:r>
-              <w:t xml:space="preserve">v1.12.0 en producción · </w:t>
-            </w:r>
-            <w:r>
               <w:rPr>
                 <w:b/>
                 <w:bCs/>
               </w:rPr>
-              <w:t>v2.0 en construcción</w:t>
-            </w:r>
-            <w:r>
-              <w:t xml:space="preserve"> (especificación aprobada)</w:t>
+              <w:t>2.0.0-alpha.1</w:t>
+            </w:r>
+            <w:r>
+              <w:t>: plataforma SaaS con el módulo 0 (clínicas, planes, identidad y aislamiento) · el resto de la v2.0 se construye por módulos (alpha.2, alpha.3…)</w:t>
             </w:r>
           </w:p>
         </w:tc>
@@ -1813,7 +1810,7 @@
         <w:pStyle w:val="Ttulo1"/>
       </w:pPr>
       <w:bookmarkStart w:id="2" w:name="_49020fb5e8f5838bf0b6b95514328e57e417f50"/>
-      <w:bookmarkStart w:id="3" w:name="_Toc242196618"/>
+      <w:bookmarkStart w:id="3" w:name="_Toc242627940"/>
       <w:bookmarkEnd w:id="0"/>
       <w:r>
         <w:lastRenderedPageBreak/>
@@ -1977,7 +1974,7 @@
         <w:pStyle w:val="Ttulo1"/>
       </w:pPr>
       <w:bookmarkStart w:id="4" w:name="_0e652f04fa4ff486c4b70e217741b0037f5beed"/>
-      <w:bookmarkStart w:id="5" w:name="_Toc242196619"/>
+      <w:bookmarkStart w:id="5" w:name="_Toc242627941"/>
       <w:bookmarkEnd w:id="2"/>
       <w:r>
         <w:lastRenderedPageBreak/>
@@ -2100,7 +2097,7 @@
         <w:t>id_clinica</w:t>
       </w:r>
       <w:r>
-        <w:t>, registro autónomo de clínicas y suscripción por planes (freemium) administrada por un super-administrador.</w:t>
+        <w:t>, registro autónomo de clínicas y suscripción por planes (freemium) administrada por un super-administrador. El gratuito admite 2 cuentas de personal (incluidas invitaciones pendientes), 50 mascotas vinculadas y 100 citas por mes calendario, sin canceladas; los propietarios no tienen límite y el profesional usa límites NULL (sin límite). Las urgencias rojas se registran incluso al límite.</w:t>
       </w:r>
     </w:p>
     <w:p>
@@ -2119,10 +2116,7 @@
         <w:t>(v2.0)</w:t>
       </w:r>
       <w:r>
-        <w:t xml:space="preserve"> </w:t>
-      </w:r>
-      <w:r>
-        <w:t xml:space="preserve">Incorporar el </w:t>
+        <w:t xml:space="preserve"> Incorporar el </w:t>
       </w:r>
       <w:r>
         <w:rPr>
@@ -2132,7 +2126,10 @@
         <w:t>Grafo I</w:t>
       </w:r>
       <w:r>
-        <w:t xml:space="preserve"> (soporte a la decisión clínica): sugerencia de diagnósticos por peso y alertas de toxicidad/interacción al prescribir.</w:t>
+        <w:t xml:space="preserve"> </w:t>
+      </w:r>
+      <w:r>
+        <w:t>(soporte a la decisión clínica): sugerencia de diagnósticos por peso y alertas de toxicidad/interacción al prescribir.</w:t>
       </w:r>
     </w:p>
     <w:p>
@@ -2188,7 +2185,7 @@
         <w:pStyle w:val="Ttulo1"/>
       </w:pPr>
       <w:bookmarkStart w:id="6" w:name="_08b2e30888045c8096cb7ace6d6d59e6ca4ea29"/>
-      <w:bookmarkStart w:id="7" w:name="_Toc242196620"/>
+      <w:bookmarkStart w:id="7" w:name="_Toc242627942"/>
       <w:bookmarkEnd w:id="4"/>
       <w:r>
         <w:lastRenderedPageBreak/>
@@ -3336,7 +3333,7 @@
         <w:pStyle w:val="Ttulo1"/>
       </w:pPr>
       <w:bookmarkStart w:id="8" w:name="_3e6d51dade5c21bd8d6e41da581621356049162"/>
-      <w:bookmarkStart w:id="9" w:name="_Toc242196621"/>
+      <w:bookmarkStart w:id="9" w:name="_Toc242627943"/>
       <w:bookmarkEnd w:id="6"/>
       <w:r>
         <w:lastRenderedPageBreak/>
@@ -3653,7 +3650,7 @@
         <w:pStyle w:val="Ttulo1"/>
       </w:pPr>
       <w:bookmarkStart w:id="10" w:name="_d6babe3a913855e3fcda84e7c8f5c33bec4b2a7"/>
-      <w:bookmarkStart w:id="11" w:name="_Toc242196622"/>
+      <w:bookmarkStart w:id="11" w:name="_Toc242627944"/>
       <w:bookmarkEnd w:id="8"/>
       <w:r>
         <w:lastRenderedPageBreak/>
@@ -4004,7 +4001,7 @@
         <w:pStyle w:val="Ttulo1"/>
       </w:pPr>
       <w:bookmarkStart w:id="12" w:name="_9cff8d485f5bd3a584165fd74df0e1d7b30fff8"/>
-      <w:bookmarkStart w:id="13" w:name="_Toc242196623"/>
+      <w:bookmarkStart w:id="13" w:name="_Toc242627945"/>
       <w:bookmarkEnd w:id="10"/>
       <w:r>
         <w:lastRenderedPageBreak/>
@@ -4428,7 +4425,7 @@
         <w:pStyle w:val="Ttulo1"/>
       </w:pPr>
       <w:bookmarkStart w:id="14" w:name="_4c1b6a2e6bf40ed5532232c550206768b663347"/>
-      <w:bookmarkStart w:id="15" w:name="_Toc242196624"/>
+      <w:bookmarkStart w:id="15" w:name="_Toc242627946"/>
       <w:bookmarkEnd w:id="12"/>
       <w:r>
         <w:lastRenderedPageBreak/>
@@ -4709,7 +4706,7 @@
               <w:keepNext/>
             </w:pPr>
             <w:r>
-              <w:t>Reglas de Negocio v2 (119 RN), Historias de Usuario v2 (95 HU) y Requisitos Específicos (418 RE)</w:t>
+              <w:t>Reglas de Negocio v2 (119 RN), Historias de Usuario v2 (95 HU) y Requisitos Específicos (420 RE)</w:t>
             </w:r>
           </w:p>
         </w:tc>
@@ -4778,7 +4775,7 @@
         <w:pStyle w:val="Ttulo1"/>
       </w:pPr>
       <w:bookmarkStart w:id="16" w:name="_460df1794ccbfd79fa1a5bca93ee20dc000123e"/>
-      <w:bookmarkStart w:id="17" w:name="_Toc242196625"/>
+      <w:bookmarkStart w:id="17" w:name="_Toc242627947"/>
       <w:bookmarkEnd w:id="14"/>
       <w:r>
         <w:lastRenderedPageBreak/>
@@ -6100,7 +6097,7 @@
         <w:pStyle w:val="Ttulo1"/>
       </w:pPr>
       <w:bookmarkStart w:id="18" w:name="_636411ae392df410ef5145f34c26b78162d7dff"/>
-      <w:bookmarkStart w:id="19" w:name="_Toc242196626"/>
+      <w:bookmarkStart w:id="19" w:name="_Toc242627948"/>
       <w:bookmarkEnd w:id="16"/>
       <w:r>
         <w:lastRenderedPageBreak/>
@@ -6221,7 +6218,7 @@
         <w:pStyle w:val="Ttulo1"/>
       </w:pPr>
       <w:bookmarkStart w:id="20" w:name="_edb780da1fab6d6f1746d6e06183b0511c299ca"/>
-      <w:bookmarkStart w:id="21" w:name="_Toc242196627"/>
+      <w:bookmarkStart w:id="21" w:name="_Toc242627949"/>
       <w:bookmarkEnd w:id="18"/>
       <w:r>
         <w:lastRenderedPageBreak/>
@@ -6319,7 +6316,7 @@
         <w:pStyle w:val="Ttulo1"/>
       </w:pPr>
       <w:bookmarkStart w:id="22" w:name="_5e924838921ac75b4be72a87c78c86221144d29"/>
-      <w:bookmarkStart w:id="23" w:name="_Toc242196628"/>
+      <w:bookmarkStart w:id="23" w:name="_Toc242627950"/>
       <w:bookmarkEnd w:id="20"/>
       <w:r>
         <w:lastRenderedPageBreak/>
@@ -6354,13 +6351,26 @@
           <w:b/>
           <w:bCs/>
         </w:rPr>
-        <w:t>v2.0 — en desarrollo (documentación completa).</w:t>
+        <w:t>v2.0 — en construcción por módulos.</w:t>
       </w:r>
       <w:r>
         <w:t xml:space="preserve"> </w:t>
       </w:r>
       <w:r>
-        <w:t>Está terminada la especificación documentación-primero: Visión y Alcance, ERS (ISO/IEC/IEEE 29148, Rev 3.1), Reglas de Negocio (Rev 2.0, 119 RN), MER, Modelos y diagramas (Fase 2, con los dos grafos y el diagrama de componentes), Historias de Usuario (Rev 3.0, 95 HU) y Requisitos Específicos (Rev 3.0, 418 RE). El siguiente paso es la construcción del software v2.0 sobre esta especificación.</w:t>
+        <w:t xml:space="preserve">La especificación documentación-primero está completa: Visión y Alcance, ERS (ISO/IEC/IEEE 29148, Rev 3.3), Reglas de Negocio (Rev 2.2, 119 RN), MER, Modelos y diagramas (Fase 2, con los dos grafos y el diagrama de componentes), Historias de Usuario (Rev 3.2, 95 HU) y Requisitos Específicos (Rev 3.2, 420 RE). La versión </w:t>
+      </w:r>
+      <w:r>
+        <w:rPr>
+          <w:b/>
+          <w:bCs/>
+        </w:rPr>
+        <w:t>2.0.0-alpha.1</w:t>
+      </w:r>
+      <w:r>
+        <w:t xml:space="preserve"> </w:t>
+      </w:r>
+      <w:r>
+        <w:t>pone en producción el módulo 0: registro y activación de clínicas, planes con sus límites, panel del super-administrador, una identidad por persona con roles por clínica y el aislamiento de los datos de cada clínica. Cada módulo siguiente publica la alfa siguiente hasta la 2.0.0.</w:t>
       </w:r>
     </w:p>
     <w:p>
@@ -6368,7 +6378,7 @@
         <w:pStyle w:val="Ttulo1"/>
       </w:pPr>
       <w:bookmarkStart w:id="24" w:name="_f0f0e6be19bb80333ff50bdb19c92b03f440bf9"/>
-      <w:bookmarkStart w:id="25" w:name="_Toc242196629"/>
+      <w:bookmarkStart w:id="25" w:name="_Toc242627951"/>
       <w:bookmarkEnd w:id="22"/>
       <w:r>
         <w:lastRenderedPageBreak/>
@@ -6431,7 +6441,10 @@
         <w:t>ISO/IEC/IEEE 29148:2018</w:t>
       </w:r>
       <w:r>
-        <w:t xml:space="preserve"> (Revisión 3.2).</w:t>
+        <w:t xml:space="preserve"> </w:t>
+      </w:r>
+      <w:r>
+        <w:t>(Revisión 3.3).</w:t>
       </w:r>
     </w:p>
     <w:p>
@@ -6443,7 +6456,7 @@
         </w:numPr>
       </w:pPr>
       <w:r>
-        <w:t>Esta Ficha Técnica del Proyecto (Revisión 3.1).</w:t>
+        <w:t>Esta Ficha Técnica del Proyecto (Revisión 3.2).</w:t>
       </w:r>
     </w:p>
     <w:p>
@@ -6455,7 +6468,7 @@
         </w:numPr>
       </w:pPr>
       <w:r>
-        <w:t>Reglas de Negocio, Historias de Usuario (Rev 3.0) y Requisitos Específicos (Rev 3.0).</w:t>
+        <w:t>Reglas de Negocio (Rev 2.2), Historias de Usuario (Rev 3.2) y Requisitos Específicos (Rev 3.2).</w:t>
       </w:r>
     </w:p>
     <w:p>
@@ -6510,10 +6523,7 @@
         </w:numPr>
       </w:pPr>
       <w:r>
-        <w:t>Presentación ejecutiva.</w:t>
-      </w:r>
-      <w:r>
-        <w:t xml:space="preserve"> </w:t>
+        <w:t xml:space="preserve">Presentación ejecutiva. </w:t>
       </w:r>
       <w:r>
         <w:rPr>
@@ -6669,7 +6679,7 @@
               <w:noProof/>
             </w:rPr>
             <w:drawing>
-              <wp:inline distT="0" distB="0" distL="0" distR="0" wp14:anchorId="02DF292F" wp14:editId="02DF2930">
+              <wp:inline distT="0" distB="0" distL="0" distR="0" wp14:anchorId="63249F43" wp14:editId="63249F44">
                 <wp:extent cx="324000" cy="324000"/>
                 <wp:effectExtent l="0" t="0" r="0" b="0"/>
                 <wp:docPr id="9001" name="Logo Zooki"/>
@@ -6763,7 +6773,7 @@
               <w:sz w:val="17"/>
               <w:szCs w:val="17"/>
             </w:rPr>
-            <w:t>Rev. 3.1</w:t>
+            <w:t>Rev. 3.2</w:t>
           </w:r>
         </w:p>
         <w:p>
@@ -6836,7 +6846,7 @@
   <w:abstractNum w:abstractNumId="0" w15:restartNumberingAfterBreak="0">
     <w:nsid w:val="0000A990"/>
     <w:multiLevelType w:val="multilevel"/>
-    <w:tmpl w:val="8BF6E74E"/>
+    <w:tmpl w:val="1D7EABFC"/>
     <w:lvl w:ilvl="0">
       <w:numFmt w:val="bullet"/>
       <w:lvlText w:val=" "/>
@@ -6913,7 +6923,7 @@
   <w:abstractNum w:abstractNumId="1" w15:restartNumberingAfterBreak="0">
     <w:nsid w:val="0000A991"/>
     <w:multiLevelType w:val="multilevel"/>
-    <w:tmpl w:val="CC5C7620"/>
+    <w:tmpl w:val="2ADC9BB8"/>
     <w:lvl w:ilvl="0">
       <w:numFmt w:val="bullet"/>
       <w:lvlText w:val=""/>
@@ -7014,22 +7024,22 @@
       </w:rPr>
     </w:lvl>
   </w:abstractNum>
-  <w:num w:numId="1" w16cid:durableId="54743741">
+  <w:num w:numId="1" w16cid:durableId="1199589090">
     <w:abstractNumId w:val="0"/>
   </w:num>
-  <w:num w:numId="2" w16cid:durableId="1750076803">
+  <w:num w:numId="2" w16cid:durableId="7608102">
     <w:abstractNumId w:val="1"/>
   </w:num>
-  <w:num w:numId="3" w16cid:durableId="641426808">
+  <w:num w:numId="3" w16cid:durableId="166596625">
     <w:abstractNumId w:val="1"/>
   </w:num>
-  <w:num w:numId="4" w16cid:durableId="860628683">
+  <w:num w:numId="4" w16cid:durableId="1782845045">
     <w:abstractNumId w:val="1"/>
   </w:num>
-  <w:num w:numId="5" w16cid:durableId="808134131">
+  <w:num w:numId="5" w16cid:durableId="1335647369">
     <w:abstractNumId w:val="1"/>
   </w:num>
-  <w:num w:numId="6" w16cid:durableId="1818496683">
+  <w:num w:numId="6" w16cid:durableId="1428888071">
     <w:abstractNumId w:val="1"/>
   </w:num>
 </w:numbering>

</xml_diff>

<commit_message>
docs(m0.1): RN-G15 y RE-T.13.5 por identificador, diagramas 10, 11 y 12.1, anexo M0.1 y descargas
</commit_message>
<xml_diff>
--- a/public/docs/descargas/ficha.docx
+++ b/public/docs/descargas/ficha.docx
@@ -93,7 +93,7 @@
           <w:noProof/>
         </w:rPr>
         <w:drawing>
-          <wp:inline distT="0" distB="0" distL="0" distR="0" wp14:anchorId="63249F37" wp14:editId="63249F38">
+          <wp:inline distT="0" distB="0" distL="0" distR="0" wp14:anchorId="4363E025" wp14:editId="4363E026">
             <wp:extent cx="395999" cy="405503"/>
             <wp:effectExtent l="0" t="0" r="0" b="0"/>
             <wp:docPr id="10" name="Picture"/>
@@ -409,7 +409,7 @@
       <w:r>
         <w:fldChar w:fldCharType="separate"/>
       </w:r>
-      <w:hyperlink w:anchor="_Toc242627939" w:history="1">
+      <w:hyperlink w:anchor="_Toc242640861" w:history="1">
         <w:r>
           <w:rPr>
             <w:rStyle w:val="Hipervnculo"/>
@@ -436,7 +436,7 @@
             <w:noProof/>
             <w:webHidden/>
           </w:rPr>
-          <w:instrText xml:space="preserve"> PAGEREF _Toc242627939 \h </w:instrText>
+          <w:instrText xml:space="preserve"> PAGEREF _Toc242640861 \h </w:instrText>
         </w:r>
         <w:r>
           <w:rPr>
@@ -482,7 +482,7 @@
           <w14:ligatures w14:val="standardContextual"/>
         </w:rPr>
       </w:pPr>
-      <w:hyperlink w:anchor="_Toc242627940" w:history="1">
+      <w:hyperlink w:anchor="_Toc242640862" w:history="1">
         <w:r>
           <w:rPr>
             <w:rStyle w:val="Hipervnculo"/>
@@ -509,7 +509,7 @@
             <w:noProof/>
             <w:webHidden/>
           </w:rPr>
-          <w:instrText xml:space="preserve"> PAGEREF _Toc242627940 \h </w:instrText>
+          <w:instrText xml:space="preserve"> PAGEREF _Toc242640862 \h </w:instrText>
         </w:r>
         <w:r>
           <w:rPr>
@@ -555,7 +555,7 @@
           <w14:ligatures w14:val="standardContextual"/>
         </w:rPr>
       </w:pPr>
-      <w:hyperlink w:anchor="_Toc242627941" w:history="1">
+      <w:hyperlink w:anchor="_Toc242640863" w:history="1">
         <w:r>
           <w:rPr>
             <w:rStyle w:val="Hipervnculo"/>
@@ -582,7 +582,7 @@
             <w:noProof/>
             <w:webHidden/>
           </w:rPr>
-          <w:instrText xml:space="preserve"> PAGEREF _Toc242627941 \h </w:instrText>
+          <w:instrText xml:space="preserve"> PAGEREF _Toc242640863 \h </w:instrText>
         </w:r>
         <w:r>
           <w:rPr>
@@ -628,7 +628,7 @@
           <w14:ligatures w14:val="standardContextual"/>
         </w:rPr>
       </w:pPr>
-      <w:hyperlink w:anchor="_Toc242627942" w:history="1">
+      <w:hyperlink w:anchor="_Toc242640864" w:history="1">
         <w:r>
           <w:rPr>
             <w:rStyle w:val="Hipervnculo"/>
@@ -655,7 +655,7 @@
             <w:noProof/>
             <w:webHidden/>
           </w:rPr>
-          <w:instrText xml:space="preserve"> PAGEREF _Toc242627942 \h </w:instrText>
+          <w:instrText xml:space="preserve"> PAGEREF _Toc242640864 \h </w:instrText>
         </w:r>
         <w:r>
           <w:rPr>
@@ -701,7 +701,7 @@
           <w14:ligatures w14:val="standardContextual"/>
         </w:rPr>
       </w:pPr>
-      <w:hyperlink w:anchor="_Toc242627943" w:history="1">
+      <w:hyperlink w:anchor="_Toc242640865" w:history="1">
         <w:r>
           <w:rPr>
             <w:rStyle w:val="Hipervnculo"/>
@@ -728,7 +728,7 @@
             <w:noProof/>
             <w:webHidden/>
           </w:rPr>
-          <w:instrText xml:space="preserve"> PAGEREF _Toc242627943 \h </w:instrText>
+          <w:instrText xml:space="preserve"> PAGEREF _Toc242640865 \h </w:instrText>
         </w:r>
         <w:r>
           <w:rPr>
@@ -774,7 +774,7 @@
           <w14:ligatures w14:val="standardContextual"/>
         </w:rPr>
       </w:pPr>
-      <w:hyperlink w:anchor="_Toc242627944" w:history="1">
+      <w:hyperlink w:anchor="_Toc242640866" w:history="1">
         <w:r>
           <w:rPr>
             <w:rStyle w:val="Hipervnculo"/>
@@ -801,7 +801,7 @@
             <w:noProof/>
             <w:webHidden/>
           </w:rPr>
-          <w:instrText xml:space="preserve"> PAGEREF _Toc242627944 \h </w:instrText>
+          <w:instrText xml:space="preserve"> PAGEREF _Toc242640866 \h </w:instrText>
         </w:r>
         <w:r>
           <w:rPr>
@@ -847,7 +847,7 @@
           <w14:ligatures w14:val="standardContextual"/>
         </w:rPr>
       </w:pPr>
-      <w:hyperlink w:anchor="_Toc242627945" w:history="1">
+      <w:hyperlink w:anchor="_Toc242640867" w:history="1">
         <w:r>
           <w:rPr>
             <w:rStyle w:val="Hipervnculo"/>
@@ -874,7 +874,7 @@
             <w:noProof/>
             <w:webHidden/>
           </w:rPr>
-          <w:instrText xml:space="preserve"> PAGEREF _Toc242627945 \h </w:instrText>
+          <w:instrText xml:space="preserve"> PAGEREF _Toc242640867 \h </w:instrText>
         </w:r>
         <w:r>
           <w:rPr>
@@ -920,7 +920,7 @@
           <w14:ligatures w14:val="standardContextual"/>
         </w:rPr>
       </w:pPr>
-      <w:hyperlink w:anchor="_Toc242627946" w:history="1">
+      <w:hyperlink w:anchor="_Toc242640868" w:history="1">
         <w:r>
           <w:rPr>
             <w:rStyle w:val="Hipervnculo"/>
@@ -947,7 +947,7 @@
             <w:noProof/>
             <w:webHidden/>
           </w:rPr>
-          <w:instrText xml:space="preserve"> PAGEREF _Toc242627946 \h </w:instrText>
+          <w:instrText xml:space="preserve"> PAGEREF _Toc242640868 \h </w:instrText>
         </w:r>
         <w:r>
           <w:rPr>
@@ -993,7 +993,7 @@
           <w14:ligatures w14:val="standardContextual"/>
         </w:rPr>
       </w:pPr>
-      <w:hyperlink w:anchor="_Toc242627947" w:history="1">
+      <w:hyperlink w:anchor="_Toc242640869" w:history="1">
         <w:r>
           <w:rPr>
             <w:rStyle w:val="Hipervnculo"/>
@@ -1020,7 +1020,7 @@
             <w:noProof/>
             <w:webHidden/>
           </w:rPr>
-          <w:instrText xml:space="preserve"> PAGEREF _Toc242627947 \h </w:instrText>
+          <w:instrText xml:space="preserve"> PAGEREF _Toc242640869 \h </w:instrText>
         </w:r>
         <w:r>
           <w:rPr>
@@ -1066,7 +1066,7 @@
           <w14:ligatures w14:val="standardContextual"/>
         </w:rPr>
       </w:pPr>
-      <w:hyperlink w:anchor="_Toc242627948" w:history="1">
+      <w:hyperlink w:anchor="_Toc242640870" w:history="1">
         <w:r>
           <w:rPr>
             <w:rStyle w:val="Hipervnculo"/>
@@ -1093,7 +1093,7 @@
             <w:noProof/>
             <w:webHidden/>
           </w:rPr>
-          <w:instrText xml:space="preserve"> PAGEREF _Toc242627948 \h </w:instrText>
+          <w:instrText xml:space="preserve"> PAGEREF _Toc242640870 \h </w:instrText>
         </w:r>
         <w:r>
           <w:rPr>
@@ -1139,7 +1139,7 @@
           <w14:ligatures w14:val="standardContextual"/>
         </w:rPr>
       </w:pPr>
-      <w:hyperlink w:anchor="_Toc242627949" w:history="1">
+      <w:hyperlink w:anchor="_Toc242640871" w:history="1">
         <w:r>
           <w:rPr>
             <w:rStyle w:val="Hipervnculo"/>
@@ -1166,7 +1166,7 @@
             <w:noProof/>
             <w:webHidden/>
           </w:rPr>
-          <w:instrText xml:space="preserve"> PAGEREF _Toc242627949 \h </w:instrText>
+          <w:instrText xml:space="preserve"> PAGEREF _Toc242640871 \h </w:instrText>
         </w:r>
         <w:r>
           <w:rPr>
@@ -1212,7 +1212,7 @@
           <w14:ligatures w14:val="standardContextual"/>
         </w:rPr>
       </w:pPr>
-      <w:hyperlink w:anchor="_Toc242627950" w:history="1">
+      <w:hyperlink w:anchor="_Toc242640872" w:history="1">
         <w:r>
           <w:rPr>
             <w:rStyle w:val="Hipervnculo"/>
@@ -1239,7 +1239,7 @@
             <w:noProof/>
             <w:webHidden/>
           </w:rPr>
-          <w:instrText xml:space="preserve"> PAGEREF _Toc242627950 \h </w:instrText>
+          <w:instrText xml:space="preserve"> PAGEREF _Toc242640872 \h </w:instrText>
         </w:r>
         <w:r>
           <w:rPr>
@@ -1285,7 +1285,7 @@
           <w14:ligatures w14:val="standardContextual"/>
         </w:rPr>
       </w:pPr>
-      <w:hyperlink w:anchor="_Toc242627951" w:history="1">
+      <w:hyperlink w:anchor="_Toc242640873" w:history="1">
         <w:r>
           <w:rPr>
             <w:rStyle w:val="Hipervnculo"/>
@@ -1312,7 +1312,7 @@
             <w:noProof/>
             <w:webHidden/>
           </w:rPr>
-          <w:instrText xml:space="preserve"> PAGEREF _Toc242627951 \h </w:instrText>
+          <w:instrText xml:space="preserve"> PAGEREF _Toc242640873 \h </w:instrText>
         </w:r>
         <w:r>
           <w:rPr>
@@ -1361,7 +1361,7 @@
         <w:pStyle w:val="Ttulo1"/>
       </w:pPr>
       <w:bookmarkStart w:id="0" w:name="_4e8520742576e7a8e4a7ac46877a11f7bda35c0"/>
-      <w:bookmarkStart w:id="1" w:name="_Toc242627939"/>
+      <w:bookmarkStart w:id="1" w:name="_Toc242640861"/>
       <w:r>
         <w:lastRenderedPageBreak/>
         <w:t>Identificación del Proyecto</w:t>
@@ -1765,10 +1765,10 @@
                 <w:b/>
                 <w:bCs/>
               </w:rPr>
-              <w:t>2.0.0-alpha.1</w:t>
-            </w:r>
-            <w:r>
-              <w:t>: plataforma SaaS con el módulo 0 (clínicas, planes, identidad y aislamiento) · el resto de la v2.0 se construye por módulos (alpha.2, alpha.3…)</w:t>
+              <w:t>2.0.0-alpha.2</w:t>
+            </w:r>
+            <w:r>
+              <w:t>: plataforma SaaS con el módulo 0 (clínicas, planes, identidad y aislamiento) y el pulido del acceso y los registros · el resto de la v2.0 se construye por módulos; cada entrega a producción sube la alfa</w:t>
             </w:r>
           </w:p>
         </w:tc>
@@ -1810,7 +1810,7 @@
         <w:pStyle w:val="Ttulo1"/>
       </w:pPr>
       <w:bookmarkStart w:id="2" w:name="_49020fb5e8f5838bf0b6b95514328e57e417f50"/>
-      <w:bookmarkStart w:id="3" w:name="_Toc242627940"/>
+      <w:bookmarkStart w:id="3" w:name="_Toc242640862"/>
       <w:bookmarkEnd w:id="0"/>
       <w:r>
         <w:lastRenderedPageBreak/>
@@ -1974,7 +1974,7 @@
         <w:pStyle w:val="Ttulo1"/>
       </w:pPr>
       <w:bookmarkStart w:id="4" w:name="_0e652f04fa4ff486c4b70e217741b0037f5beed"/>
-      <w:bookmarkStart w:id="5" w:name="_Toc242627941"/>
+      <w:bookmarkStart w:id="5" w:name="_Toc242640863"/>
       <w:bookmarkEnd w:id="2"/>
       <w:r>
         <w:lastRenderedPageBreak/>
@@ -2185,7 +2185,7 @@
         <w:pStyle w:val="Ttulo1"/>
       </w:pPr>
       <w:bookmarkStart w:id="6" w:name="_08b2e30888045c8096cb7ace6d6d59e6ca4ea29"/>
-      <w:bookmarkStart w:id="7" w:name="_Toc242627942"/>
+      <w:bookmarkStart w:id="7" w:name="_Toc242640864"/>
       <w:bookmarkEnd w:id="4"/>
       <w:r>
         <w:lastRenderedPageBreak/>
@@ -3333,7 +3333,7 @@
         <w:pStyle w:val="Ttulo1"/>
       </w:pPr>
       <w:bookmarkStart w:id="8" w:name="_3e6d51dade5c21bd8d6e41da581621356049162"/>
-      <w:bookmarkStart w:id="9" w:name="_Toc242627943"/>
+      <w:bookmarkStart w:id="9" w:name="_Toc242640865"/>
       <w:bookmarkEnd w:id="6"/>
       <w:r>
         <w:lastRenderedPageBreak/>
@@ -3650,7 +3650,7 @@
         <w:pStyle w:val="Ttulo1"/>
       </w:pPr>
       <w:bookmarkStart w:id="10" w:name="_d6babe3a913855e3fcda84e7c8f5c33bec4b2a7"/>
-      <w:bookmarkStart w:id="11" w:name="_Toc242627944"/>
+      <w:bookmarkStart w:id="11" w:name="_Toc242640866"/>
       <w:bookmarkEnd w:id="8"/>
       <w:r>
         <w:lastRenderedPageBreak/>
@@ -4001,7 +4001,7 @@
         <w:pStyle w:val="Ttulo1"/>
       </w:pPr>
       <w:bookmarkStart w:id="12" w:name="_9cff8d485f5bd3a584165fd74df0e1d7b30fff8"/>
-      <w:bookmarkStart w:id="13" w:name="_Toc242627945"/>
+      <w:bookmarkStart w:id="13" w:name="_Toc242640867"/>
       <w:bookmarkEnd w:id="10"/>
       <w:r>
         <w:lastRenderedPageBreak/>
@@ -4425,7 +4425,7 @@
         <w:pStyle w:val="Ttulo1"/>
       </w:pPr>
       <w:bookmarkStart w:id="14" w:name="_4c1b6a2e6bf40ed5532232c550206768b663347"/>
-      <w:bookmarkStart w:id="15" w:name="_Toc242627946"/>
+      <w:bookmarkStart w:id="15" w:name="_Toc242640868"/>
       <w:bookmarkEnd w:id="12"/>
       <w:r>
         <w:lastRenderedPageBreak/>
@@ -4775,7 +4775,7 @@
         <w:pStyle w:val="Ttulo1"/>
       </w:pPr>
       <w:bookmarkStart w:id="16" w:name="_460df1794ccbfd79fa1a5bca93ee20dc000123e"/>
-      <w:bookmarkStart w:id="17" w:name="_Toc242627947"/>
+      <w:bookmarkStart w:id="17" w:name="_Toc242640869"/>
       <w:bookmarkEnd w:id="14"/>
       <w:r>
         <w:lastRenderedPageBreak/>
@@ -6097,7 +6097,7 @@
         <w:pStyle w:val="Ttulo1"/>
       </w:pPr>
       <w:bookmarkStart w:id="18" w:name="_636411ae392df410ef5145f34c26b78162d7dff"/>
-      <w:bookmarkStart w:id="19" w:name="_Toc242627948"/>
+      <w:bookmarkStart w:id="19" w:name="_Toc242640870"/>
       <w:bookmarkEnd w:id="16"/>
       <w:r>
         <w:lastRenderedPageBreak/>
@@ -6218,7 +6218,7 @@
         <w:pStyle w:val="Ttulo1"/>
       </w:pPr>
       <w:bookmarkStart w:id="20" w:name="_edb780da1fab6d6f1746d6e06183b0511c299ca"/>
-      <w:bookmarkStart w:id="21" w:name="_Toc242627949"/>
+      <w:bookmarkStart w:id="21" w:name="_Toc242640871"/>
       <w:bookmarkEnd w:id="18"/>
       <w:r>
         <w:lastRenderedPageBreak/>
@@ -6316,7 +6316,7 @@
         <w:pStyle w:val="Ttulo1"/>
       </w:pPr>
       <w:bookmarkStart w:id="22" w:name="_5e924838921ac75b4be72a87c78c86221144d29"/>
-      <w:bookmarkStart w:id="23" w:name="_Toc242627950"/>
+      <w:bookmarkStart w:id="23" w:name="_Toc242640872"/>
       <w:bookmarkEnd w:id="20"/>
       <w:r>
         <w:lastRenderedPageBreak/>
@@ -6370,7 +6370,7 @@
         <w:t xml:space="preserve"> </w:t>
       </w:r>
       <w:r>
-        <w:t>pone en producción el módulo 0: registro y activación de clínicas, planes con sus límites, panel del super-administrador, una identidad por persona con roles por clínica y el aislamiento de los datos de cada clínica. Cada módulo siguiente publica la alfa siguiente hasta la 2.0.0.</w:t>
+        <w:t>pone en producción el módulo 0: registro y activación de clínicas, planes con sus límites, panel del super-administrador, una identidad por persona con roles por clínica y el aislamiento de los datos de cada clínica. La 2.0.0-alpha.2 pule el inicio de sesión y los registros. Cada entrega a producción publica la alfa siguiente hasta la 2.0.0.</w:t>
       </w:r>
     </w:p>
     <w:p>
@@ -6378,7 +6378,7 @@
         <w:pStyle w:val="Ttulo1"/>
       </w:pPr>
       <w:bookmarkStart w:id="24" w:name="_f0f0e6be19bb80333ff50bdb19c92b03f440bf9"/>
-      <w:bookmarkStart w:id="25" w:name="_Toc242627951"/>
+      <w:bookmarkStart w:id="25" w:name="_Toc242640873"/>
       <w:bookmarkEnd w:id="22"/>
       <w:r>
         <w:lastRenderedPageBreak/>
@@ -6441,10 +6441,7 @@
         <w:t>ISO/IEC/IEEE 29148:2018</w:t>
       </w:r>
       <w:r>
-        <w:t xml:space="preserve"> </w:t>
-      </w:r>
-      <w:r>
-        <w:t>(Revisión 3.3).</w:t>
+        <w:t xml:space="preserve"> (Revisión 3.3).</w:t>
       </w:r>
     </w:p>
     <w:p>
@@ -6679,7 +6676,7 @@
               <w:noProof/>
             </w:rPr>
             <w:drawing>
-              <wp:inline distT="0" distB="0" distL="0" distR="0" wp14:anchorId="63249F43" wp14:editId="63249F44">
+              <wp:inline distT="0" distB="0" distL="0" distR="0" wp14:anchorId="4363E031" wp14:editId="4363E032">
                 <wp:extent cx="324000" cy="324000"/>
                 <wp:effectExtent l="0" t="0" r="0" b="0"/>
                 <wp:docPr id="9001" name="Logo Zooki"/>
@@ -6846,7 +6843,7 @@
   <w:abstractNum w:abstractNumId="0" w15:restartNumberingAfterBreak="0">
     <w:nsid w:val="0000A990"/>
     <w:multiLevelType w:val="multilevel"/>
-    <w:tmpl w:val="1D7EABFC"/>
+    <w:tmpl w:val="D2B85DD0"/>
     <w:lvl w:ilvl="0">
       <w:numFmt w:val="bullet"/>
       <w:lvlText w:val=" "/>
@@ -6923,7 +6920,7 @@
   <w:abstractNum w:abstractNumId="1" w15:restartNumberingAfterBreak="0">
     <w:nsid w:val="0000A991"/>
     <w:multiLevelType w:val="multilevel"/>
-    <w:tmpl w:val="2ADC9BB8"/>
+    <w:tmpl w:val="6278F132"/>
     <w:lvl w:ilvl="0">
       <w:numFmt w:val="bullet"/>
       <w:lvlText w:val=""/>
@@ -7024,22 +7021,22 @@
       </w:rPr>
     </w:lvl>
   </w:abstractNum>
-  <w:num w:numId="1" w16cid:durableId="1199589090">
+  <w:num w:numId="1" w16cid:durableId="913394190">
     <w:abstractNumId w:val="0"/>
   </w:num>
-  <w:num w:numId="2" w16cid:durableId="7608102">
+  <w:num w:numId="2" w16cid:durableId="983899351">
     <w:abstractNumId w:val="1"/>
   </w:num>
-  <w:num w:numId="3" w16cid:durableId="166596625">
+  <w:num w:numId="3" w16cid:durableId="477186253">
     <w:abstractNumId w:val="1"/>
   </w:num>
-  <w:num w:numId="4" w16cid:durableId="1782845045">
+  <w:num w:numId="4" w16cid:durableId="874923998">
     <w:abstractNumId w:val="1"/>
   </w:num>
-  <w:num w:numId="5" w16cid:durableId="1335647369">
+  <w:num w:numId="5" w16cid:durableId="2111656859">
     <w:abstractNumId w:val="1"/>
   </w:num>
-  <w:num w:numId="6" w16cid:durableId="1428888071">
+  <w:num w:numId="6" w16cid:durableId="1193879105">
     <w:abstractNumId w:val="1"/>
   </w:num>
 </w:numbering>

</xml_diff>

<commit_message>
docs: HU-6.1 con RE-6.1.8 a RE-6.1.12, HU-2.2 sin Consultas medicas y estado de la entrega
</commit_message>
<xml_diff>
--- a/public/docs/descargas/ficha.docx
+++ b/public/docs/descargas/ficha.docx
@@ -93,7 +93,7 @@
           <w:noProof/>
         </w:rPr>
         <w:drawing>
-          <wp:inline distT="0" distB="0" distL="0" distR="0" wp14:anchorId="1AC79B6E" wp14:editId="1AC79B6F">
+          <wp:inline distT="0" distB="0" distL="0" distR="0" wp14:anchorId="71A66825" wp14:editId="71A66826">
             <wp:extent cx="395999" cy="405503"/>
             <wp:effectExtent l="0" t="0" r="0" b="0"/>
             <wp:docPr id="10" name="Picture"/>
@@ -229,7 +229,7 @@
               <w:pStyle w:val="Celda"/>
             </w:pPr>
             <w:r>
-              <w:t>16/10/2026</w:t>
+              <w:t>22/10/2026</w:t>
             </w:r>
           </w:p>
         </w:tc>
@@ -409,7 +409,7 @@
       <w:r>
         <w:fldChar w:fldCharType="separate"/>
       </w:r>
-      <w:hyperlink w:anchor="_Toc243039958" w:history="1">
+      <w:hyperlink w:anchor="_Toc243596273" w:history="1">
         <w:r>
           <w:rPr>
             <w:rStyle w:val="Hipervnculo"/>
@@ -436,7 +436,7 @@
             <w:noProof/>
             <w:webHidden/>
           </w:rPr>
-          <w:instrText xml:space="preserve"> PAGEREF _Toc243039958 \h </w:instrText>
+          <w:instrText xml:space="preserve"> PAGEREF _Toc243596273 \h </w:instrText>
         </w:r>
         <w:r>
           <w:rPr>
@@ -456,7 +456,7 @@
             <w:noProof/>
             <w:webHidden/>
           </w:rPr>
-          <w:t>4</w:t>
+          <w:t>5</w:t>
         </w:r>
         <w:r>
           <w:rPr>
@@ -482,7 +482,7 @@
           <w14:ligatures w14:val="standardContextual"/>
         </w:rPr>
       </w:pPr>
-      <w:hyperlink w:anchor="_Toc243039959" w:history="1">
+      <w:hyperlink w:anchor="_Toc243596274" w:history="1">
         <w:r>
           <w:rPr>
             <w:rStyle w:val="Hipervnculo"/>
@@ -509,7 +509,7 @@
             <w:noProof/>
             <w:webHidden/>
           </w:rPr>
-          <w:instrText xml:space="preserve"> PAGEREF _Toc243039959 \h </w:instrText>
+          <w:instrText xml:space="preserve"> PAGEREF _Toc243596274 \h </w:instrText>
         </w:r>
         <w:r>
           <w:rPr>
@@ -529,7 +529,7 @@
             <w:noProof/>
             <w:webHidden/>
           </w:rPr>
-          <w:t>5</w:t>
+          <w:t>6</w:t>
         </w:r>
         <w:r>
           <w:rPr>
@@ -555,7 +555,7 @@
           <w14:ligatures w14:val="standardContextual"/>
         </w:rPr>
       </w:pPr>
-      <w:hyperlink w:anchor="_Toc243039960" w:history="1">
+      <w:hyperlink w:anchor="_Toc243596275" w:history="1">
         <w:r>
           <w:rPr>
             <w:rStyle w:val="Hipervnculo"/>
@@ -582,7 +582,7 @@
             <w:noProof/>
             <w:webHidden/>
           </w:rPr>
-          <w:instrText xml:space="preserve"> PAGEREF _Toc243039960 \h </w:instrText>
+          <w:instrText xml:space="preserve"> PAGEREF _Toc243596275 \h </w:instrText>
         </w:r>
         <w:r>
           <w:rPr>
@@ -602,7 +602,7 @@
             <w:noProof/>
             <w:webHidden/>
           </w:rPr>
-          <w:t>6</w:t>
+          <w:t>7</w:t>
         </w:r>
         <w:r>
           <w:rPr>
@@ -628,7 +628,7 @@
           <w14:ligatures w14:val="standardContextual"/>
         </w:rPr>
       </w:pPr>
-      <w:hyperlink w:anchor="_Toc243039961" w:history="1">
+      <w:hyperlink w:anchor="_Toc243596276" w:history="1">
         <w:r>
           <w:rPr>
             <w:rStyle w:val="Hipervnculo"/>
@@ -655,7 +655,7 @@
             <w:noProof/>
             <w:webHidden/>
           </w:rPr>
-          <w:instrText xml:space="preserve"> PAGEREF _Toc243039961 \h </w:instrText>
+          <w:instrText xml:space="preserve"> PAGEREF _Toc243596276 \h </w:instrText>
         </w:r>
         <w:r>
           <w:rPr>
@@ -675,7 +675,7 @@
             <w:noProof/>
             <w:webHidden/>
           </w:rPr>
-          <w:t>7</w:t>
+          <w:t>8</w:t>
         </w:r>
         <w:r>
           <w:rPr>
@@ -701,7 +701,7 @@
           <w14:ligatures w14:val="standardContextual"/>
         </w:rPr>
       </w:pPr>
-      <w:hyperlink w:anchor="_Toc243039962" w:history="1">
+      <w:hyperlink w:anchor="_Toc243596277" w:history="1">
         <w:r>
           <w:rPr>
             <w:rStyle w:val="Hipervnculo"/>
@@ -728,7 +728,7 @@
             <w:noProof/>
             <w:webHidden/>
           </w:rPr>
-          <w:instrText xml:space="preserve"> PAGEREF _Toc243039962 \h </w:instrText>
+          <w:instrText xml:space="preserve"> PAGEREF _Toc243596277 \h </w:instrText>
         </w:r>
         <w:r>
           <w:rPr>
@@ -748,7 +748,7 @@
             <w:noProof/>
             <w:webHidden/>
           </w:rPr>
-          <w:t>9</w:t>
+          <w:t>10</w:t>
         </w:r>
         <w:r>
           <w:rPr>
@@ -774,7 +774,7 @@
           <w14:ligatures w14:val="standardContextual"/>
         </w:rPr>
       </w:pPr>
-      <w:hyperlink w:anchor="_Toc243039963" w:history="1">
+      <w:hyperlink w:anchor="_Toc243596278" w:history="1">
         <w:r>
           <w:rPr>
             <w:rStyle w:val="Hipervnculo"/>
@@ -801,7 +801,7 @@
             <w:noProof/>
             <w:webHidden/>
           </w:rPr>
-          <w:instrText xml:space="preserve"> PAGEREF _Toc243039963 \h </w:instrText>
+          <w:instrText xml:space="preserve"> PAGEREF _Toc243596278 \h </w:instrText>
         </w:r>
         <w:r>
           <w:rPr>
@@ -821,7 +821,7 @@
             <w:noProof/>
             <w:webHidden/>
           </w:rPr>
-          <w:t>10</w:t>
+          <w:t>11</w:t>
         </w:r>
         <w:r>
           <w:rPr>
@@ -847,7 +847,7 @@
           <w14:ligatures w14:val="standardContextual"/>
         </w:rPr>
       </w:pPr>
-      <w:hyperlink w:anchor="_Toc243039964" w:history="1">
+      <w:hyperlink w:anchor="_Toc243596279" w:history="1">
         <w:r>
           <w:rPr>
             <w:rStyle w:val="Hipervnculo"/>
@@ -874,7 +874,7 @@
             <w:noProof/>
             <w:webHidden/>
           </w:rPr>
-          <w:instrText xml:space="preserve"> PAGEREF _Toc243039964 \h </w:instrText>
+          <w:instrText xml:space="preserve"> PAGEREF _Toc243596279 \h </w:instrText>
         </w:r>
         <w:r>
           <w:rPr>
@@ -894,7 +894,7 @@
             <w:noProof/>
             <w:webHidden/>
           </w:rPr>
-          <w:t>11</w:t>
+          <w:t>12</w:t>
         </w:r>
         <w:r>
           <w:rPr>
@@ -920,7 +920,7 @@
           <w14:ligatures w14:val="standardContextual"/>
         </w:rPr>
       </w:pPr>
-      <w:hyperlink w:anchor="_Toc243039965" w:history="1">
+      <w:hyperlink w:anchor="_Toc243596280" w:history="1">
         <w:r>
           <w:rPr>
             <w:rStyle w:val="Hipervnculo"/>
@@ -947,7 +947,7 @@
             <w:noProof/>
             <w:webHidden/>
           </w:rPr>
-          <w:instrText xml:space="preserve"> PAGEREF _Toc243039965 \h </w:instrText>
+          <w:instrText xml:space="preserve"> PAGEREF _Toc243596280 \h </w:instrText>
         </w:r>
         <w:r>
           <w:rPr>
@@ -967,7 +967,7 @@
             <w:noProof/>
             <w:webHidden/>
           </w:rPr>
-          <w:t>12</w:t>
+          <w:t>13</w:t>
         </w:r>
         <w:r>
           <w:rPr>
@@ -993,7 +993,7 @@
           <w14:ligatures w14:val="standardContextual"/>
         </w:rPr>
       </w:pPr>
-      <w:hyperlink w:anchor="_Toc243039966" w:history="1">
+      <w:hyperlink w:anchor="_Toc243596281" w:history="1">
         <w:r>
           <w:rPr>
             <w:rStyle w:val="Hipervnculo"/>
@@ -1020,7 +1020,7 @@
             <w:noProof/>
             <w:webHidden/>
           </w:rPr>
-          <w:instrText xml:space="preserve"> PAGEREF _Toc243039966 \h </w:instrText>
+          <w:instrText xml:space="preserve"> PAGEREF _Toc243596281 \h </w:instrText>
         </w:r>
         <w:r>
           <w:rPr>
@@ -1040,7 +1040,7 @@
             <w:noProof/>
             <w:webHidden/>
           </w:rPr>
-          <w:t>13</w:t>
+          <w:t>14</w:t>
         </w:r>
         <w:r>
           <w:rPr>
@@ -1066,7 +1066,7 @@
           <w14:ligatures w14:val="standardContextual"/>
         </w:rPr>
       </w:pPr>
-      <w:hyperlink w:anchor="_Toc243039967" w:history="1">
+      <w:hyperlink w:anchor="_Toc243596282" w:history="1">
         <w:r>
           <w:rPr>
             <w:rStyle w:val="Hipervnculo"/>
@@ -1093,7 +1093,7 @@
             <w:noProof/>
             <w:webHidden/>
           </w:rPr>
-          <w:instrText xml:space="preserve"> PAGEREF _Toc243039967 \h </w:instrText>
+          <w:instrText xml:space="preserve"> PAGEREF _Toc243596282 \h </w:instrText>
         </w:r>
         <w:r>
           <w:rPr>
@@ -1113,7 +1113,7 @@
             <w:noProof/>
             <w:webHidden/>
           </w:rPr>
-          <w:t>14</w:t>
+          <w:t>15</w:t>
         </w:r>
         <w:r>
           <w:rPr>
@@ -1139,7 +1139,7 @@
           <w14:ligatures w14:val="standardContextual"/>
         </w:rPr>
       </w:pPr>
-      <w:hyperlink w:anchor="_Toc243039968" w:history="1">
+      <w:hyperlink w:anchor="_Toc243596283" w:history="1">
         <w:r>
           <w:rPr>
             <w:rStyle w:val="Hipervnculo"/>
@@ -1166,7 +1166,7 @@
             <w:noProof/>
             <w:webHidden/>
           </w:rPr>
-          <w:instrText xml:space="preserve"> PAGEREF _Toc243039968 \h </w:instrText>
+          <w:instrText xml:space="preserve"> PAGEREF _Toc243596283 \h </w:instrText>
         </w:r>
         <w:r>
           <w:rPr>
@@ -1186,7 +1186,7 @@
             <w:noProof/>
             <w:webHidden/>
           </w:rPr>
-          <w:t>15</w:t>
+          <w:t>16</w:t>
         </w:r>
         <w:r>
           <w:rPr>
@@ -1212,7 +1212,7 @@
           <w14:ligatures w14:val="standardContextual"/>
         </w:rPr>
       </w:pPr>
-      <w:hyperlink w:anchor="_Toc243039969" w:history="1">
+      <w:hyperlink w:anchor="_Toc243596284" w:history="1">
         <w:r>
           <w:rPr>
             <w:rStyle w:val="Hipervnculo"/>
@@ -1239,7 +1239,7 @@
             <w:noProof/>
             <w:webHidden/>
           </w:rPr>
-          <w:instrText xml:space="preserve"> PAGEREF _Toc243039969 \h </w:instrText>
+          <w:instrText xml:space="preserve"> PAGEREF _Toc243596284 \h </w:instrText>
         </w:r>
         <w:r>
           <w:rPr>
@@ -1259,7 +1259,7 @@
             <w:noProof/>
             <w:webHidden/>
           </w:rPr>
-          <w:t>16</w:t>
+          <w:t>17</w:t>
         </w:r>
         <w:r>
           <w:rPr>
@@ -1285,7 +1285,7 @@
           <w14:ligatures w14:val="standardContextual"/>
         </w:rPr>
       </w:pPr>
-      <w:hyperlink w:anchor="_Toc243039970" w:history="1">
+      <w:hyperlink w:anchor="_Toc243596285" w:history="1">
         <w:r>
           <w:rPr>
             <w:rStyle w:val="Hipervnculo"/>
@@ -1312,7 +1312,7 @@
             <w:noProof/>
             <w:webHidden/>
           </w:rPr>
-          <w:instrText xml:space="preserve"> PAGEREF _Toc243039970 \h </w:instrText>
+          <w:instrText xml:space="preserve"> PAGEREF _Toc243596285 \h </w:instrText>
         </w:r>
         <w:r>
           <w:rPr>
@@ -1332,7 +1332,7 @@
             <w:noProof/>
             <w:webHidden/>
           </w:rPr>
-          <w:t>17</w:t>
+          <w:t>18</w:t>
         </w:r>
         <w:r>
           <w:rPr>
@@ -1358,10 +1358,26 @@
     </w:p>
     <w:p>
       <w:pPr>
+        <w:pStyle w:val="Textodebloque"/>
+      </w:pPr>
+      <w:r>
+        <w:rPr>
+          <w:b/>
+          <w:bCs/>
+        </w:rPr>
+        <w:lastRenderedPageBreak/>
+        <w:t>Preparación M4/B2 — 2026-10-18:</w:t>
+      </w:r>
+      <w:r>
+        <w:t xml:space="preserve"> 96 HU, 430 RE y 120 RN; esquema de 58 tablas en 01/MER/drawDB y migración 08 preparados para revisión, sin despliegue ni flujos C implementados. Producción alpha.4 conserva sus 52 tablas hasta desplegar; sin nueva revisión/versión.</w:t>
+      </w:r>
+    </w:p>
+    <w:p>
+      <w:pPr>
         <w:pStyle w:val="Ttulo1"/>
       </w:pPr>
       <w:bookmarkStart w:id="0" w:name="_4e8520742576e7a8e4a7ac46877a11f7bda35c0"/>
-      <w:bookmarkStart w:id="1" w:name="_Toc243039958"/>
+      <w:bookmarkStart w:id="1" w:name="_Toc243596273"/>
       <w:r>
         <w:lastRenderedPageBreak/>
         <w:t>Identificación del Proyecto</w:t>
@@ -1765,10 +1781,10 @@
                 <w:b/>
                 <w:bCs/>
               </w:rPr>
-              <w:t>2.0.0-alpha.4 preparada</w:t>
-            </w:r>
-            <w:r>
-              <w:t>: módulos 0, 5 y M2 clínico/Grafo I; producción sigue en alpha.3 hasta desplegar. Motor de triage listo para M4; carnet/QR al final de la v2.0; conocimiento pendiente de validación veterinaria</w:t>
+              <w:t>2.0.0-alpha.4 desplegada</w:t>
+            </w:r>
+            <w:r>
+              <w:t>: módulos 0, 5 y M2 clínico/Grafo I; M4/B2 prepara solo datos, pendiente de revisión. Destino de agenda propuesto, todavía sin implementación; carnet/QR al final de v2.0 y conocimiento pendiente de validación veterinaria</w:t>
             </w:r>
           </w:p>
         </w:tc>
@@ -1810,7 +1826,7 @@
         <w:pStyle w:val="Ttulo1"/>
       </w:pPr>
       <w:bookmarkStart w:id="2" w:name="_49020fb5e8f5838bf0b6b95514328e57e417f50"/>
-      <w:bookmarkStart w:id="3" w:name="_Toc243039959"/>
+      <w:bookmarkStart w:id="3" w:name="_Toc243596274"/>
       <w:bookmarkEnd w:id="0"/>
       <w:r>
         <w:lastRenderedPageBreak/>
@@ -1974,7 +1990,7 @@
         <w:pStyle w:val="Ttulo1"/>
       </w:pPr>
       <w:bookmarkStart w:id="4" w:name="_0e652f04fa4ff486c4b70e217741b0037f5beed"/>
-      <w:bookmarkStart w:id="5" w:name="_Toc243039960"/>
+      <w:bookmarkStart w:id="5" w:name="_Toc243596275"/>
       <w:bookmarkEnd w:id="2"/>
       <w:r>
         <w:lastRenderedPageBreak/>
@@ -2185,7 +2201,7 @@
         <w:pStyle w:val="Ttulo1"/>
       </w:pPr>
       <w:bookmarkStart w:id="6" w:name="_08b2e30888045c8096cb7ace6d6d59e6ca4ea29"/>
-      <w:bookmarkStart w:id="7" w:name="_Toc243039961"/>
+      <w:bookmarkStart w:id="7" w:name="_Toc243596276"/>
       <w:bookmarkEnd w:id="4"/>
       <w:r>
         <w:lastRenderedPageBreak/>
@@ -3395,7 +3411,7 @@
       </w:pPr>
       <w:r>
         <w:lastRenderedPageBreak/>
-        <w:t xml:space="preserve">M2 entrega conocimiento global versionado con fuentes y validación veterinaria pendiente: 105 nodos, 105 aristas, 201 sinónimos, 29 reglas y 47 fuentes. HU-2.12 permite al superadministrador explorarlo sin editar ni acceder a pacientes; los motores apoyan el diagnóstico y la prescripción. El esquema tiene 52 tablas de negocio, más la tabla técnica </w:t>
+        <w:t xml:space="preserve">M2 entrega conocimiento global versionado con fuentes y validación veterinaria pendiente: 105 nodos, 105 aristas, 201 sinónimos, 29 reglas y 47 fuentes. HU-2.12 permite al superadministrador explorarlo sin editar ni acceder a pacientes; los motores apoyan el diagnóstico y la prescripción. El esquema preparado por B2 tiene 58 tablas de negocio; producción alpha.4 conserva 52 hasta aplicar la migración 08 al desplegar. Se añade aparte la tabla técnica </w:t>
       </w:r>
       <w:r>
         <w:rPr>
@@ -3412,7 +3428,7 @@
         <w:pStyle w:val="Ttulo1"/>
       </w:pPr>
       <w:bookmarkStart w:id="8" w:name="_3e6d51dade5c21bd8d6e41da581621356049162"/>
-      <w:bookmarkStart w:id="9" w:name="_Toc243039962"/>
+      <w:bookmarkStart w:id="9" w:name="_Toc243596277"/>
       <w:bookmarkEnd w:id="6"/>
       <w:r>
         <w:lastRenderedPageBreak/>
@@ -3729,7 +3745,7 @@
         <w:pStyle w:val="Ttulo1"/>
       </w:pPr>
       <w:bookmarkStart w:id="10" w:name="_d6babe3a913855e3fcda84e7c8f5c33bec4b2a7"/>
-      <w:bookmarkStart w:id="11" w:name="_Toc243039963"/>
+      <w:bookmarkStart w:id="11" w:name="_Toc243596278"/>
       <w:bookmarkEnd w:id="8"/>
       <w:r>
         <w:lastRenderedPageBreak/>
@@ -4080,7 +4096,7 @@
         <w:pStyle w:val="Ttulo1"/>
       </w:pPr>
       <w:bookmarkStart w:id="12" w:name="_9cff8d485f5bd3a584165fd74df0e1d7b30fff8"/>
-      <w:bookmarkStart w:id="13" w:name="_Toc243039964"/>
+      <w:bookmarkStart w:id="13" w:name="_Toc243596279"/>
       <w:bookmarkEnd w:id="10"/>
       <w:r>
         <w:lastRenderedPageBreak/>
@@ -4504,7 +4520,7 @@
         <w:pStyle w:val="Ttulo1"/>
       </w:pPr>
       <w:bookmarkStart w:id="14" w:name="_4c1b6a2e6bf40ed5532232c550206768b663347"/>
-      <w:bookmarkStart w:id="15" w:name="_Toc243039965"/>
+      <w:bookmarkStart w:id="15" w:name="_Toc243596280"/>
       <w:bookmarkEnd w:id="12"/>
       <w:r>
         <w:lastRenderedPageBreak/>
@@ -4785,7 +4801,7 @@
               <w:keepNext/>
             </w:pPr>
             <w:r>
-              <w:t>Reglas de Negocio v2 (120 RN), Historias de Usuario v2 (96 HU) y Requisitos Específicos (427 RE)</w:t>
+              <w:t>Reglas de Negocio v2 (120 RN), Historias de Usuario v2 (96 HU) y Requisitos Específicos (435 RE)</w:t>
             </w:r>
           </w:p>
         </w:tc>
@@ -4854,7 +4870,7 @@
         <w:pStyle w:val="Ttulo1"/>
       </w:pPr>
       <w:bookmarkStart w:id="16" w:name="_460df1794ccbfd79fa1a5bca93ee20dc000123e"/>
-      <w:bookmarkStart w:id="17" w:name="_Toc243039966"/>
+      <w:bookmarkStart w:id="17" w:name="_Toc243596281"/>
       <w:bookmarkEnd w:id="14"/>
       <w:r>
         <w:lastRenderedPageBreak/>
@@ -6176,7 +6192,7 @@
         <w:pStyle w:val="Ttulo1"/>
       </w:pPr>
       <w:bookmarkStart w:id="18" w:name="_636411ae392df410ef5145f34c26b78162d7dff"/>
-      <w:bookmarkStart w:id="19" w:name="_Toc243039967"/>
+      <w:bookmarkStart w:id="19" w:name="_Toc243596282"/>
       <w:bookmarkEnd w:id="16"/>
       <w:r>
         <w:lastRenderedPageBreak/>
@@ -6297,7 +6313,7 @@
         <w:pStyle w:val="Ttulo1"/>
       </w:pPr>
       <w:bookmarkStart w:id="20" w:name="_edb780da1fab6d6f1746d6e06183b0511c299ca"/>
-      <w:bookmarkStart w:id="21" w:name="_Toc243039968"/>
+      <w:bookmarkStart w:id="21" w:name="_Toc243596283"/>
       <w:bookmarkEnd w:id="18"/>
       <w:r>
         <w:lastRenderedPageBreak/>
@@ -6395,7 +6411,7 @@
         <w:pStyle w:val="Ttulo1"/>
       </w:pPr>
       <w:bookmarkStart w:id="22" w:name="_5e924838921ac75b4be72a87c78c86221144d29"/>
-      <w:bookmarkStart w:id="23" w:name="_Toc243039969"/>
+      <w:bookmarkStart w:id="23" w:name="_Toc243596284"/>
       <w:bookmarkEnd w:id="20"/>
       <w:r>
         <w:lastRenderedPageBreak/>
@@ -6436,7 +6452,7 @@
         <w:t xml:space="preserve"> </w:t>
       </w:r>
       <w:r>
-        <w:t xml:space="preserve">La especificación documentación-primero está completa: Visión y Alcance, ERS (ISO/IEC/IEEE 29148, Rev 3.5), Reglas de Negocio (Rev 2.4, 120 RN), MER, Modelos y diagramas (Fase 2, con los dos grafos y el diagrama de componentes), Historias de Usuario (Rev 3.4, 96 HU) y Requisitos Específicos (Rev 3.4, 427 RE). La versión </w:t>
+        <w:t xml:space="preserve">La especificación documentación-primero está completa: Visión y Alcance, ERS (ISO/IEC/IEEE 29148, Rev 3.5), Reglas de Negocio (Rev 2.4, 120 RN), MER, Modelos y diagramas (Fase 2, con los dos grafos y el diagrama de componentes), Historias de Usuario (Rev 3.4, 96 HU) y Requisitos Específicos (Rev 3.4, 435 RE). La versión </w:t>
       </w:r>
       <w:r>
         <w:rPr>
@@ -6449,10 +6465,10 @@
         <w:t xml:space="preserve"> </w:t>
       </w:r>
       <w:r>
-        <w:t>pone en producción el módulo 0: registro y activación de clínicas, planes con sus límites, panel del super-administrador, una identidad por persona con roles por clínica y el aislamiento de los datos de cada clínica. La 2.0.0-alpha.2 pule el inicio de sesión y los registros, y la 2.0.0-alpha.3 trae el portal del propietario multi-clínica: todas sus mascotas e historia en todas sus clínicas, vínculos con tope de 3 clínicas y la historia compartida bajo su autorización. La 2.0.0-alpha.4 prepara el cierre de M</w:t>
-      </w:r>
-      <w:r>
-        <w:t>2: alergias y alertas compartidas, síntomas, apoyo diagnóstico, alertas de prescripción y mapa del conocimiento; el triage operativo queda en M4 y el carnet al final de la v2.0. Todo el conocimiento sigue pendiente de validación veterinaria. Cada entrega a producción publica la alfa siguiente hasta la 2.0.0.</w:t>
+        <w:t xml:space="preserve">pone en producción el módulo 0: registro y activación de clínicas, planes con sus límites, panel del super-administrador, una identidad por persona con roles por clínica y el aislamiento de los datos de cada clínica. La 2.0.0-alpha.2 pule el inicio de sesión y los registros, y la 2.0.0-alpha.3 trae el portal del propietario multi-clínica: todas sus mascotas e historia en todas sus clínicas, vínculos con tope de 3 clínicas y la historia compartida bajo su autorización. La 2.0.0-alpha.4 desplegada cierra M2: </w:t>
+      </w:r>
+      <w:r>
+        <w:t>alergias y alertas compartidas, síntomas, apoyo diagnóstico, alertas de prescripción y mapa del conocimiento; el triage operativo queda en M4 y el carnet al final de la v2.0. Todo el conocimiento sigue pendiente de validación veterinaria. Cada entrega a producción publica la alfa siguiente hasta la 2.0.0.</w:t>
       </w:r>
     </w:p>
     <w:p>
@@ -6460,7 +6476,7 @@
         <w:pStyle w:val="Ttulo1"/>
       </w:pPr>
       <w:bookmarkStart w:id="24" w:name="_f0f0e6be19bb80333ff50bdb19c92b03f440bf9"/>
-      <w:bookmarkStart w:id="25" w:name="_Toc243039970"/>
+      <w:bookmarkStart w:id="25" w:name="_Toc243596285"/>
       <w:bookmarkEnd w:id="22"/>
       <w:r>
         <w:lastRenderedPageBreak/>
@@ -6758,7 +6774,7 @@
               <w:noProof/>
             </w:rPr>
             <w:drawing>
-              <wp:inline distT="0" distB="0" distL="0" distR="0" wp14:anchorId="1AC79B7A" wp14:editId="1AC79B7B">
+              <wp:inline distT="0" distB="0" distL="0" distR="0" wp14:anchorId="71A66831" wp14:editId="71A66832">
                 <wp:extent cx="324000" cy="324000"/>
                 <wp:effectExtent l="0" t="0" r="0" b="0"/>
                 <wp:docPr id="9001" name="Logo Zooki"/>
@@ -6925,7 +6941,7 @@
   <w:abstractNum w:abstractNumId="0" w15:restartNumberingAfterBreak="0">
     <w:nsid w:val="0000A990"/>
     <w:multiLevelType w:val="multilevel"/>
-    <w:tmpl w:val="717AF75A"/>
+    <w:tmpl w:val="AE8A5774"/>
     <w:lvl w:ilvl="0">
       <w:numFmt w:val="bullet"/>
       <w:lvlText w:val=" "/>
@@ -7002,7 +7018,7 @@
   <w:abstractNum w:abstractNumId="1" w15:restartNumberingAfterBreak="0">
     <w:nsid w:val="0000A991"/>
     <w:multiLevelType w:val="multilevel"/>
-    <w:tmpl w:val="12768786"/>
+    <w:tmpl w:val="825CAAD8"/>
     <w:lvl w:ilvl="0">
       <w:numFmt w:val="bullet"/>
       <w:lvlText w:val=""/>
@@ -7103,22 +7119,22 @@
       </w:rPr>
     </w:lvl>
   </w:abstractNum>
-  <w:num w:numId="1" w16cid:durableId="140080713">
+  <w:num w:numId="1" w16cid:durableId="1199127232">
     <w:abstractNumId w:val="0"/>
   </w:num>
-  <w:num w:numId="2" w16cid:durableId="946158901">
+  <w:num w:numId="2" w16cid:durableId="858004766">
     <w:abstractNumId w:val="1"/>
   </w:num>
-  <w:num w:numId="3" w16cid:durableId="1509708461">
+  <w:num w:numId="3" w16cid:durableId="749887038">
     <w:abstractNumId w:val="1"/>
   </w:num>
-  <w:num w:numId="4" w16cid:durableId="1832794655">
+  <w:num w:numId="4" w16cid:durableId="56246238">
     <w:abstractNumId w:val="1"/>
   </w:num>
-  <w:num w:numId="5" w16cid:durableId="100036859">
+  <w:num w:numId="5" w16cid:durableId="155343968">
     <w:abstractNumId w:val="1"/>
   </w:num>
-  <w:num w:numId="6" w16cid:durableId="1544713282">
+  <w:num w:numId="6" w16cid:durableId="661784009">
     <w:abstractNumId w:val="1"/>
   </w:num>
 </w:numbering>

</xml_diff>

<commit_message>
docs(release): v2.0.0 con el carnet QR y revision de B (HU-5.10, HU-5.11)
</commit_message>
<xml_diff>
--- a/public/docs/descargas/ficha.docx
+++ b/public/docs/descargas/ficha.docx
@@ -29,7 +29,7 @@
         <w:pStyle w:val="PortadaRevision"/>
       </w:pPr>
       <w:r>
-        <w:t>Revisión 3.4</w:t>
+        <w:t>Revisión 3.5</w:t>
       </w:r>
     </w:p>
     <w:p>
@@ -93,7 +93,7 @@
           <w:noProof/>
         </w:rPr>
         <w:drawing>
-          <wp:inline distT="0" distB="0" distL="0" distR="0" wp14:anchorId="71A66825" wp14:editId="71A66826">
+          <wp:inline distT="0" distB="0" distL="0" distR="0" wp14:anchorId="4546767E" wp14:editId="4546767F">
             <wp:extent cx="395999" cy="405503"/>
             <wp:effectExtent l="0" t="0" r="0" b="0"/>
             <wp:docPr id="10" name="Picture"/>
@@ -229,7 +229,7 @@
               <w:pStyle w:val="Celda"/>
             </w:pPr>
             <w:r>
-              <w:t>22/10/2026</w:t>
+              <w:t>23/10/2026</w:t>
             </w:r>
           </w:p>
         </w:tc>
@@ -242,7 +242,7 @@
               <w:pStyle w:val="Celda"/>
             </w:pPr>
             <w:r>
-              <w:t>3.4</w:t>
+              <w:t>3.5</w:t>
             </w:r>
           </w:p>
         </w:tc>
@@ -409,7 +409,7 @@
       <w:r>
         <w:fldChar w:fldCharType="separate"/>
       </w:r>
-      <w:hyperlink w:anchor="_Toc243596273" w:history="1">
+      <w:hyperlink w:anchor="_Toc243683861" w:history="1">
         <w:r>
           <w:rPr>
             <w:rStyle w:val="Hipervnculo"/>
@@ -436,7 +436,7 @@
             <w:noProof/>
             <w:webHidden/>
           </w:rPr>
-          <w:instrText xml:space="preserve"> PAGEREF _Toc243596273 \h </w:instrText>
+          <w:instrText xml:space="preserve"> PAGEREF _Toc243683861 \h </w:instrText>
         </w:r>
         <w:r>
           <w:rPr>
@@ -482,7 +482,7 @@
           <w14:ligatures w14:val="standardContextual"/>
         </w:rPr>
       </w:pPr>
-      <w:hyperlink w:anchor="_Toc243596274" w:history="1">
+      <w:hyperlink w:anchor="_Toc243683862" w:history="1">
         <w:r>
           <w:rPr>
             <w:rStyle w:val="Hipervnculo"/>
@@ -509,7 +509,7 @@
             <w:noProof/>
             <w:webHidden/>
           </w:rPr>
-          <w:instrText xml:space="preserve"> PAGEREF _Toc243596274 \h </w:instrText>
+          <w:instrText xml:space="preserve"> PAGEREF _Toc243683862 \h </w:instrText>
         </w:r>
         <w:r>
           <w:rPr>
@@ -555,7 +555,7 @@
           <w14:ligatures w14:val="standardContextual"/>
         </w:rPr>
       </w:pPr>
-      <w:hyperlink w:anchor="_Toc243596275" w:history="1">
+      <w:hyperlink w:anchor="_Toc243683863" w:history="1">
         <w:r>
           <w:rPr>
             <w:rStyle w:val="Hipervnculo"/>
@@ -582,7 +582,7 @@
             <w:noProof/>
             <w:webHidden/>
           </w:rPr>
-          <w:instrText xml:space="preserve"> PAGEREF _Toc243596275 \h </w:instrText>
+          <w:instrText xml:space="preserve"> PAGEREF _Toc243683863 \h </w:instrText>
         </w:r>
         <w:r>
           <w:rPr>
@@ -628,7 +628,7 @@
           <w14:ligatures w14:val="standardContextual"/>
         </w:rPr>
       </w:pPr>
-      <w:hyperlink w:anchor="_Toc243596276" w:history="1">
+      <w:hyperlink w:anchor="_Toc243683864" w:history="1">
         <w:r>
           <w:rPr>
             <w:rStyle w:val="Hipervnculo"/>
@@ -655,7 +655,7 @@
             <w:noProof/>
             <w:webHidden/>
           </w:rPr>
-          <w:instrText xml:space="preserve"> PAGEREF _Toc243596276 \h </w:instrText>
+          <w:instrText xml:space="preserve"> PAGEREF _Toc243683864 \h </w:instrText>
         </w:r>
         <w:r>
           <w:rPr>
@@ -701,7 +701,7 @@
           <w14:ligatures w14:val="standardContextual"/>
         </w:rPr>
       </w:pPr>
-      <w:hyperlink w:anchor="_Toc243596277" w:history="1">
+      <w:hyperlink w:anchor="_Toc243683865" w:history="1">
         <w:r>
           <w:rPr>
             <w:rStyle w:val="Hipervnculo"/>
@@ -728,7 +728,7 @@
             <w:noProof/>
             <w:webHidden/>
           </w:rPr>
-          <w:instrText xml:space="preserve"> PAGEREF _Toc243596277 \h </w:instrText>
+          <w:instrText xml:space="preserve"> PAGEREF _Toc243683865 \h </w:instrText>
         </w:r>
         <w:r>
           <w:rPr>
@@ -774,7 +774,7 @@
           <w14:ligatures w14:val="standardContextual"/>
         </w:rPr>
       </w:pPr>
-      <w:hyperlink w:anchor="_Toc243596278" w:history="1">
+      <w:hyperlink w:anchor="_Toc243683866" w:history="1">
         <w:r>
           <w:rPr>
             <w:rStyle w:val="Hipervnculo"/>
@@ -801,7 +801,7 @@
             <w:noProof/>
             <w:webHidden/>
           </w:rPr>
-          <w:instrText xml:space="preserve"> PAGEREF _Toc243596278 \h </w:instrText>
+          <w:instrText xml:space="preserve"> PAGEREF _Toc243683866 \h </w:instrText>
         </w:r>
         <w:r>
           <w:rPr>
@@ -847,7 +847,7 @@
           <w14:ligatures w14:val="standardContextual"/>
         </w:rPr>
       </w:pPr>
-      <w:hyperlink w:anchor="_Toc243596279" w:history="1">
+      <w:hyperlink w:anchor="_Toc243683867" w:history="1">
         <w:r>
           <w:rPr>
             <w:rStyle w:val="Hipervnculo"/>
@@ -874,7 +874,7 @@
             <w:noProof/>
             <w:webHidden/>
           </w:rPr>
-          <w:instrText xml:space="preserve"> PAGEREF _Toc243596279 \h </w:instrText>
+          <w:instrText xml:space="preserve"> PAGEREF _Toc243683867 \h </w:instrText>
         </w:r>
         <w:r>
           <w:rPr>
@@ -920,7 +920,7 @@
           <w14:ligatures w14:val="standardContextual"/>
         </w:rPr>
       </w:pPr>
-      <w:hyperlink w:anchor="_Toc243596280" w:history="1">
+      <w:hyperlink w:anchor="_Toc243683868" w:history="1">
         <w:r>
           <w:rPr>
             <w:rStyle w:val="Hipervnculo"/>
@@ -947,7 +947,7 @@
             <w:noProof/>
             <w:webHidden/>
           </w:rPr>
-          <w:instrText xml:space="preserve"> PAGEREF _Toc243596280 \h </w:instrText>
+          <w:instrText xml:space="preserve"> PAGEREF _Toc243683868 \h </w:instrText>
         </w:r>
         <w:r>
           <w:rPr>
@@ -993,7 +993,7 @@
           <w14:ligatures w14:val="standardContextual"/>
         </w:rPr>
       </w:pPr>
-      <w:hyperlink w:anchor="_Toc243596281" w:history="1">
+      <w:hyperlink w:anchor="_Toc243683869" w:history="1">
         <w:r>
           <w:rPr>
             <w:rStyle w:val="Hipervnculo"/>
@@ -1020,7 +1020,7 @@
             <w:noProof/>
             <w:webHidden/>
           </w:rPr>
-          <w:instrText xml:space="preserve"> PAGEREF _Toc243596281 \h </w:instrText>
+          <w:instrText xml:space="preserve"> PAGEREF _Toc243683869 \h </w:instrText>
         </w:r>
         <w:r>
           <w:rPr>
@@ -1066,7 +1066,7 @@
           <w14:ligatures w14:val="standardContextual"/>
         </w:rPr>
       </w:pPr>
-      <w:hyperlink w:anchor="_Toc243596282" w:history="1">
+      <w:hyperlink w:anchor="_Toc243683870" w:history="1">
         <w:r>
           <w:rPr>
             <w:rStyle w:val="Hipervnculo"/>
@@ -1093,7 +1093,7 @@
             <w:noProof/>
             <w:webHidden/>
           </w:rPr>
-          <w:instrText xml:space="preserve"> PAGEREF _Toc243596282 \h </w:instrText>
+          <w:instrText xml:space="preserve"> PAGEREF _Toc243683870 \h </w:instrText>
         </w:r>
         <w:r>
           <w:rPr>
@@ -1139,7 +1139,7 @@
           <w14:ligatures w14:val="standardContextual"/>
         </w:rPr>
       </w:pPr>
-      <w:hyperlink w:anchor="_Toc243596283" w:history="1">
+      <w:hyperlink w:anchor="_Toc243683871" w:history="1">
         <w:r>
           <w:rPr>
             <w:rStyle w:val="Hipervnculo"/>
@@ -1166,7 +1166,7 @@
             <w:noProof/>
             <w:webHidden/>
           </w:rPr>
-          <w:instrText xml:space="preserve"> PAGEREF _Toc243596283 \h </w:instrText>
+          <w:instrText xml:space="preserve"> PAGEREF _Toc243683871 \h </w:instrText>
         </w:r>
         <w:r>
           <w:rPr>
@@ -1212,7 +1212,7 @@
           <w14:ligatures w14:val="standardContextual"/>
         </w:rPr>
       </w:pPr>
-      <w:hyperlink w:anchor="_Toc243596284" w:history="1">
+      <w:hyperlink w:anchor="_Toc243683872" w:history="1">
         <w:r>
           <w:rPr>
             <w:rStyle w:val="Hipervnculo"/>
@@ -1239,7 +1239,7 @@
             <w:noProof/>
             <w:webHidden/>
           </w:rPr>
-          <w:instrText xml:space="preserve"> PAGEREF _Toc243596284 \h </w:instrText>
+          <w:instrText xml:space="preserve"> PAGEREF _Toc243683872 \h </w:instrText>
         </w:r>
         <w:r>
           <w:rPr>
@@ -1285,7 +1285,7 @@
           <w14:ligatures w14:val="standardContextual"/>
         </w:rPr>
       </w:pPr>
-      <w:hyperlink w:anchor="_Toc243596285" w:history="1">
+      <w:hyperlink w:anchor="_Toc243683873" w:history="1">
         <w:r>
           <w:rPr>
             <w:rStyle w:val="Hipervnculo"/>
@@ -1312,7 +1312,7 @@
             <w:noProof/>
             <w:webHidden/>
           </w:rPr>
-          <w:instrText xml:space="preserve"> PAGEREF _Toc243596285 \h </w:instrText>
+          <w:instrText xml:space="preserve"> PAGEREF _Toc243683873 \h </w:instrText>
         </w:r>
         <w:r>
           <w:rPr>
@@ -1377,7 +1377,7 @@
         <w:pStyle w:val="Ttulo1"/>
       </w:pPr>
       <w:bookmarkStart w:id="0" w:name="_4e8520742576e7a8e4a7ac46877a11f7bda35c0"/>
-      <w:bookmarkStart w:id="1" w:name="_Toc243596273"/>
+      <w:bookmarkStart w:id="1" w:name="_Toc243683861"/>
       <w:r>
         <w:lastRenderedPageBreak/>
         <w:t>Identificación del Proyecto</w:t>
@@ -1781,10 +1781,10 @@
                 <w:b/>
                 <w:bCs/>
               </w:rPr>
-              <w:t>2.0.0-alpha.4 desplegada</w:t>
-            </w:r>
-            <w:r>
-              <w:t>: módulos 0, 5 y M2 clínico/Grafo I; M4/B2 prepara solo datos, pendiente de revisión. Destino de agenda propuesto, todavía sin implementación; carnet/QR al final de v2.0 y conocimiento pendiente de validación veterinaria</w:t>
+              <w:t>2.0.0 preparada para revisión e integración</w:t>
+            </w:r>
+            <w:r>
+              <w:t>: base SaaS, portal multi-clínica, historia clínica/Grafo I, agenda/Grafo II y carnet QR público con escaneos y ubicación consentida. Producción se confirma tras desplegar; conocimiento pendiente de validación veterinaria</w:t>
             </w:r>
           </w:p>
         </w:tc>
@@ -1815,7 +1815,7 @@
               <w:pStyle w:val="Celda"/>
             </w:pPr>
             <w:r>
-              <w:t>3.1 — Octubre 2026</w:t>
+              <w:t>3.5 — Octubre 2026</w:t>
             </w:r>
           </w:p>
         </w:tc>
@@ -1826,7 +1826,7 @@
         <w:pStyle w:val="Ttulo1"/>
       </w:pPr>
       <w:bookmarkStart w:id="2" w:name="_49020fb5e8f5838bf0b6b95514328e57e417f50"/>
-      <w:bookmarkStart w:id="3" w:name="_Toc243596274"/>
+      <w:bookmarkStart w:id="3" w:name="_Toc243683862"/>
       <w:bookmarkEnd w:id="0"/>
       <w:r>
         <w:lastRenderedPageBreak/>
@@ -1990,7 +1990,7 @@
         <w:pStyle w:val="Ttulo1"/>
       </w:pPr>
       <w:bookmarkStart w:id="4" w:name="_0e652f04fa4ff486c4b70e217741b0037f5beed"/>
-      <w:bookmarkStart w:id="5" w:name="_Toc243596275"/>
+      <w:bookmarkStart w:id="5" w:name="_Toc243683863"/>
       <w:bookmarkEnd w:id="2"/>
       <w:r>
         <w:lastRenderedPageBreak/>
@@ -2201,7 +2201,7 @@
         <w:pStyle w:val="Ttulo1"/>
       </w:pPr>
       <w:bookmarkStart w:id="6" w:name="_08b2e30888045c8096cb7ace6d6d59e6ca4ea29"/>
-      <w:bookmarkStart w:id="7" w:name="_Toc243596276"/>
+      <w:bookmarkStart w:id="7" w:name="_Toc243683864"/>
       <w:bookmarkEnd w:id="4"/>
       <w:r>
         <w:lastRenderedPageBreak/>
@@ -3411,7 +3411,7 @@
       </w:pPr>
       <w:r>
         <w:lastRenderedPageBreak/>
-        <w:t xml:space="preserve">M2 entrega conocimiento global versionado con fuentes y validación veterinaria pendiente: 105 nodos, 105 aristas, 201 sinónimos, 29 reglas y 47 fuentes. HU-2.12 permite al superadministrador explorarlo sin editar ni acceder a pacientes; los motores apoyan el diagnóstico y la prescripción. El esquema preparado por B2 tiene 58 tablas de negocio; producción alpha.4 conserva 52 hasta aplicar la migración 08 al desplegar. Se añade aparte la tabla técnica </w:t>
+        <w:t xml:space="preserve">M2 entrega conocimiento global versionado con fuentes y validación veterinaria pendiente: 105 nodos, 105 aristas, 201 sinónimos, 29 reglas y 47 fuentes. HU-2.12 permite al superadministrador explorarlo sin editar ni acceder a pacientes; los motores apoyan el diagnóstico y la prescripción. El esquema de 2.0.0 tiene 59 tablas de negocio, incluida carnet_accesos para limitar consultas públicas sin guardar mascota ni token. Se añade aparte la tabla técnica </w:t>
       </w:r>
       <w:r>
         <w:rPr>
@@ -3420,7 +3420,15 @@
         <w:t>schema_migraciones</w:t>
       </w:r>
       <w:r>
-        <w:t xml:space="preserve"> del migrador; el triage y su batería de 26 casos quedan listos para M4.</w:t>
+        <w:t xml:space="preserve"> del migrador. La migración 11 es automática y repetible. Se mantienen 96 HU, 435 RE y 120 RN; el carnet cierra las 29 HU de la entrega v2.0.</w:t>
+      </w:r>
+    </w:p>
+    <w:p>
+      <w:pPr>
+        <w:pStyle w:val="Textoindependiente"/>
+      </w:pPr>
+      <w:r>
+        <w:t>Salvedad acordada con el dueño el 23/10/2026: el QR del portal en el correo de alta (RE-5.8.4) queda para una entrega aparte; el correo ya incluye el enlace de acceso. El QR de emergencia de cada mascota sí se entrega en este cierre.</w:t>
       </w:r>
     </w:p>
     <w:p>
@@ -3428,7 +3436,7 @@
         <w:pStyle w:val="Ttulo1"/>
       </w:pPr>
       <w:bookmarkStart w:id="8" w:name="_3e6d51dade5c21bd8d6e41da581621356049162"/>
-      <w:bookmarkStart w:id="9" w:name="_Toc243596277"/>
+      <w:bookmarkStart w:id="9" w:name="_Toc243683865"/>
       <w:bookmarkEnd w:id="6"/>
       <w:r>
         <w:lastRenderedPageBreak/>
@@ -3745,7 +3753,7 @@
         <w:pStyle w:val="Ttulo1"/>
       </w:pPr>
       <w:bookmarkStart w:id="10" w:name="_d6babe3a913855e3fcda84e7c8f5c33bec4b2a7"/>
-      <w:bookmarkStart w:id="11" w:name="_Toc243596278"/>
+      <w:bookmarkStart w:id="11" w:name="_Toc243683866"/>
       <w:bookmarkEnd w:id="8"/>
       <w:r>
         <w:lastRenderedPageBreak/>
@@ -4096,7 +4104,7 @@
         <w:pStyle w:val="Ttulo1"/>
       </w:pPr>
       <w:bookmarkStart w:id="12" w:name="_9cff8d485f5bd3a584165fd74df0e1d7b30fff8"/>
-      <w:bookmarkStart w:id="13" w:name="_Toc243596279"/>
+      <w:bookmarkStart w:id="13" w:name="_Toc243683867"/>
       <w:bookmarkEnd w:id="10"/>
       <w:r>
         <w:lastRenderedPageBreak/>
@@ -4520,7 +4528,7 @@
         <w:pStyle w:val="Ttulo1"/>
       </w:pPr>
       <w:bookmarkStart w:id="14" w:name="_4c1b6a2e6bf40ed5532232c550206768b663347"/>
-      <w:bookmarkStart w:id="15" w:name="_Toc243596280"/>
+      <w:bookmarkStart w:id="15" w:name="_Toc243683868"/>
       <w:bookmarkEnd w:id="12"/>
       <w:r>
         <w:lastRenderedPageBreak/>
@@ -4870,7 +4878,7 @@
         <w:pStyle w:val="Ttulo1"/>
       </w:pPr>
       <w:bookmarkStart w:id="16" w:name="_460df1794ccbfd79fa1a5bca93ee20dc000123e"/>
-      <w:bookmarkStart w:id="17" w:name="_Toc243596281"/>
+      <w:bookmarkStart w:id="17" w:name="_Toc243683869"/>
       <w:bookmarkEnd w:id="14"/>
       <w:r>
         <w:lastRenderedPageBreak/>
@@ -6192,7 +6200,7 @@
         <w:pStyle w:val="Ttulo1"/>
       </w:pPr>
       <w:bookmarkStart w:id="18" w:name="_636411ae392df410ef5145f34c26b78162d7dff"/>
-      <w:bookmarkStart w:id="19" w:name="_Toc243596282"/>
+      <w:bookmarkStart w:id="19" w:name="_Toc243683870"/>
       <w:bookmarkEnd w:id="16"/>
       <w:r>
         <w:lastRenderedPageBreak/>
@@ -6313,7 +6321,7 @@
         <w:pStyle w:val="Ttulo1"/>
       </w:pPr>
       <w:bookmarkStart w:id="20" w:name="_edb780da1fab6d6f1746d6e06183b0511c299ca"/>
-      <w:bookmarkStart w:id="21" w:name="_Toc243596283"/>
+      <w:bookmarkStart w:id="21" w:name="_Toc243683871"/>
       <w:bookmarkEnd w:id="18"/>
       <w:r>
         <w:lastRenderedPageBreak/>
@@ -6411,7 +6419,7 @@
         <w:pStyle w:val="Ttulo1"/>
       </w:pPr>
       <w:bookmarkStart w:id="22" w:name="_5e924838921ac75b4be72a87c78c86221144d29"/>
-      <w:bookmarkStart w:id="23" w:name="_Toc243596284"/>
+      <w:bookmarkStart w:id="23" w:name="_Toc243683872"/>
       <w:bookmarkEnd w:id="20"/>
       <w:r>
         <w:lastRenderedPageBreak/>
@@ -6476,7 +6484,7 @@
         <w:pStyle w:val="Ttulo1"/>
       </w:pPr>
       <w:bookmarkStart w:id="24" w:name="_f0f0e6be19bb80333ff50bdb19c92b03f440bf9"/>
-      <w:bookmarkStart w:id="25" w:name="_Toc243596285"/>
+      <w:bookmarkStart w:id="25" w:name="_Toc243683873"/>
       <w:bookmarkEnd w:id="22"/>
       <w:r>
         <w:lastRenderedPageBreak/>
@@ -6539,7 +6547,7 @@
         <w:t>ISO/IEC/IEEE 29148:2018</w:t>
       </w:r>
       <w:r>
-        <w:t xml:space="preserve"> (Revisión 3.5).</w:t>
+        <w:t xml:space="preserve"> (Revisión 3.6).</w:t>
       </w:r>
     </w:p>
     <w:p>
@@ -6551,7 +6559,7 @@
         </w:numPr>
       </w:pPr>
       <w:r>
-        <w:t>Esta Ficha Técnica del Proyecto (Revisión 3.4).</w:t>
+        <w:t>Esta Ficha Técnica del Proyecto (Revisión 3.5).</w:t>
       </w:r>
     </w:p>
     <w:p>
@@ -6563,7 +6571,7 @@
         </w:numPr>
       </w:pPr>
       <w:r>
-        <w:t>Reglas de Negocio (Rev 2.4), Historias de Usuario (Rev 3.4) y Requisitos Específicos (Rev 3.4).</w:t>
+        <w:t>Reglas de Negocio (Rev 2.5), Historias de Usuario (Rev 3.6) y Requisitos Específicos (Rev 3.5).</w:t>
       </w:r>
     </w:p>
     <w:p>
@@ -6774,7 +6782,7 @@
               <w:noProof/>
             </w:rPr>
             <w:drawing>
-              <wp:inline distT="0" distB="0" distL="0" distR="0" wp14:anchorId="71A66831" wp14:editId="71A66832">
+              <wp:inline distT="0" distB="0" distL="0" distR="0" wp14:anchorId="4546768A" wp14:editId="4546768B">
                 <wp:extent cx="324000" cy="324000"/>
                 <wp:effectExtent l="0" t="0" r="0" b="0"/>
                 <wp:docPr id="9001" name="Logo Zooki"/>
@@ -6868,7 +6876,7 @@
               <w:sz w:val="17"/>
               <w:szCs w:val="17"/>
             </w:rPr>
-            <w:t>Rev. 3.4</w:t>
+            <w:t>Rev. 3.5</w:t>
           </w:r>
         </w:p>
         <w:p>
@@ -6941,7 +6949,7 @@
   <w:abstractNum w:abstractNumId="0" w15:restartNumberingAfterBreak="0">
     <w:nsid w:val="0000A990"/>
     <w:multiLevelType w:val="multilevel"/>
-    <w:tmpl w:val="AE8A5774"/>
+    <w:tmpl w:val="75FA6066"/>
     <w:lvl w:ilvl="0">
       <w:numFmt w:val="bullet"/>
       <w:lvlText w:val=" "/>
@@ -7018,7 +7026,7 @@
   <w:abstractNum w:abstractNumId="1" w15:restartNumberingAfterBreak="0">
     <w:nsid w:val="0000A991"/>
     <w:multiLevelType w:val="multilevel"/>
-    <w:tmpl w:val="825CAAD8"/>
+    <w:tmpl w:val="420C587E"/>
     <w:lvl w:ilvl="0">
       <w:numFmt w:val="bullet"/>
       <w:lvlText w:val=""/>
@@ -7119,22 +7127,22 @@
       </w:rPr>
     </w:lvl>
   </w:abstractNum>
-  <w:num w:numId="1" w16cid:durableId="1199127232">
+  <w:num w:numId="1" w16cid:durableId="644547739">
     <w:abstractNumId w:val="0"/>
   </w:num>
-  <w:num w:numId="2" w16cid:durableId="858004766">
+  <w:num w:numId="2" w16cid:durableId="984427668">
     <w:abstractNumId w:val="1"/>
   </w:num>
-  <w:num w:numId="3" w16cid:durableId="749887038">
+  <w:num w:numId="3" w16cid:durableId="730079783">
     <w:abstractNumId w:val="1"/>
   </w:num>
-  <w:num w:numId="4" w16cid:durableId="56246238">
+  <w:num w:numId="4" w16cid:durableId="1961453115">
     <w:abstractNumId w:val="1"/>
   </w:num>
-  <w:num w:numId="5" w16cid:durableId="155343968">
+  <w:num w:numId="5" w16cid:durableId="1810130673">
     <w:abstractNumId w:val="1"/>
   </w:num>
-  <w:num w:numId="6" w16cid:durableId="661784009">
+  <w:num w:numId="6" w16cid:durableId="197284883">
     <w:abstractNumId w:val="1"/>
   </w:num>
 </w:numbering>

</xml_diff>